<commit_message>
Reorganized Folder structure and added separate folder for post man
</commit_message>
<xml_diff>
--- a/flutter more documents/f20_flutter_extras_of_basic.docx
+++ b/flutter more documents/f20_flutter_extras_of_basic.docx
@@ -11756,56 +11756,6 @@
           <w:sz w:val="36"/>
           <w:szCs w:val="36"/>
         </w:rPr>
-        <w:t xml:space="preserve"># We can create our own UI element like a segment button using </w:t>
-      </w:r>
-      <w:r>
-        <w:rPr>
-          <w:b/>
-          <w:bCs/>
-          <w:sz w:val="36"/>
-          <w:szCs w:val="36"/>
-        </w:rPr>
-        <w:t>Container</w:t>
-      </w:r>
-      <w:r>
-        <w:rPr>
-          <w:sz w:val="36"/>
-          <w:szCs w:val="36"/>
-        </w:rPr>
-        <w:t xml:space="preserve"> widget</w:t>
-      </w:r>
-      <w:r>
-        <w:rPr>
-          <w:sz w:val="36"/>
-          <w:szCs w:val="36"/>
-        </w:rPr>
-        <w:t xml:space="preserve"> and </w:t>
-      </w:r>
-      <w:proofErr w:type="spellStart"/>
-      <w:r>
-        <w:rPr>
-          <w:b/>
-          <w:bCs/>
-          <w:sz w:val="36"/>
-          <w:szCs w:val="36"/>
-        </w:rPr>
-        <w:t>ListView.builder</w:t>
-      </w:r>
-      <w:proofErr w:type="spellEnd"/>
-    </w:p>
-    <w:p>
-      <w:pPr>
-        <w:jc w:val="both"/>
-        <w:rPr>
-          <w:sz w:val="36"/>
-          <w:szCs w:val="36"/>
-        </w:rPr>
-      </w:pPr>
-      <w:r>
-        <w:rPr>
-          <w:sz w:val="36"/>
-          <w:szCs w:val="36"/>
-        </w:rPr>
         <w:t xml:space="preserve"># </w:t>
       </w:r>
       <w:r>
@@ -11813,23 +11763,37 @@
           <w:sz w:val="36"/>
           <w:szCs w:val="36"/>
         </w:rPr>
-        <w:t>First declare a class and make sure it takes three things:</w:t>
-      </w:r>
-    </w:p>
-    <w:p>
-      <w:pPr>
-        <w:pStyle w:val="ListParagraph"/>
-        <w:numPr>
-          <w:ilvl w:val="0"/>
-          <w:numId w:val="21"/>
-        </w:numPr>
-        <w:jc w:val="both"/>
-        <w:rPr>
-          <w:sz w:val="36"/>
-          <w:szCs w:val="36"/>
-        </w:rPr>
-      </w:pPr>
-      <w:proofErr w:type="spellStart"/>
+        <w:t>See f45 advanced UI design doc</w:t>
+      </w:r>
+    </w:p>
+    <w:p>
+      <w:pPr>
+        <w:jc w:val="both"/>
+        <w:rPr>
+          <w:sz w:val="36"/>
+          <w:szCs w:val="36"/>
+        </w:rPr>
+      </w:pPr>
+    </w:p>
+    <w:p>
+      <w:pPr>
+        <w:jc w:val="both"/>
+        <w:rPr>
+          <w:sz w:val="36"/>
+          <w:szCs w:val="36"/>
+        </w:rPr>
+      </w:pPr>
+    </w:p>
+    <w:p>
+      <w:pPr>
+        <w:jc w:val="both"/>
+        <w:rPr>
+          <w:b/>
+          <w:bCs/>
+          <w:sz w:val="36"/>
+          <w:szCs w:val="36"/>
+        </w:rPr>
+      </w:pPr>
       <w:r>
         <w:rPr>
           <w:b/>
@@ -11838,3379 +11802,6 @@
           <w:szCs w:val="36"/>
         </w:rPr>
         <w:lastRenderedPageBreak/>
-        <w:t>initialValue</w:t>
-      </w:r>
-      <w:proofErr w:type="spellEnd"/>
-      <w:r>
-        <w:rPr>
-          <w:sz w:val="36"/>
-          <w:szCs w:val="36"/>
-        </w:rPr>
-        <w:t xml:space="preserve"> </w:t>
-      </w:r>
-      <w:r>
-        <w:sym w:font="Wingdings" w:char="F0E0"/>
-      </w:r>
-      <w:r>
-        <w:rPr>
-          <w:sz w:val="36"/>
-          <w:szCs w:val="36"/>
-        </w:rPr>
-        <w:t xml:space="preserve"> the value to be selected when page is loaded</w:t>
-      </w:r>
-    </w:p>
-    <w:p>
-      <w:pPr>
-        <w:pStyle w:val="ListParagraph"/>
-        <w:numPr>
-          <w:ilvl w:val="0"/>
-          <w:numId w:val="21"/>
-        </w:numPr>
-        <w:jc w:val="both"/>
-        <w:rPr>
-          <w:sz w:val="36"/>
-          <w:szCs w:val="36"/>
-        </w:rPr>
-      </w:pPr>
-      <w:r>
-        <w:rPr>
-          <w:b/>
-          <w:bCs/>
-          <w:sz w:val="36"/>
-          <w:szCs w:val="36"/>
-        </w:rPr>
-        <w:t>colors</w:t>
-      </w:r>
-      <w:r>
-        <w:rPr>
-          <w:sz w:val="36"/>
-          <w:szCs w:val="36"/>
-        </w:rPr>
-        <w:t xml:space="preserve"> </w:t>
-      </w:r>
-      <w:r>
-        <w:sym w:font="Wingdings" w:char="F0E0"/>
-      </w:r>
-      <w:r>
-        <w:rPr>
-          <w:sz w:val="36"/>
-          <w:szCs w:val="36"/>
-        </w:rPr>
-        <w:t xml:space="preserve"> the list of</w:t>
-      </w:r>
-      <w:r>
-        <w:rPr>
-          <w:b/>
-          <w:bCs/>
-          <w:sz w:val="36"/>
-          <w:szCs w:val="36"/>
-        </w:rPr>
-        <w:t xml:space="preserve"> </w:t>
-      </w:r>
-      <w:r>
-        <w:rPr>
-          <w:b/>
-          <w:bCs/>
-          <w:sz w:val="36"/>
-          <w:szCs w:val="36"/>
-        </w:rPr>
-        <w:t>String</w:t>
-      </w:r>
-      <w:r>
-        <w:rPr>
-          <w:sz w:val="36"/>
-          <w:szCs w:val="36"/>
-        </w:rPr>
-        <w:t>’</w:t>
-      </w:r>
-      <w:r>
-        <w:rPr>
-          <w:sz w:val="36"/>
-          <w:szCs w:val="36"/>
-        </w:rPr>
-        <w:t xml:space="preserve">s to be built in </w:t>
-      </w:r>
-      <w:r>
-        <w:rPr>
-          <w:b/>
-          <w:bCs/>
-          <w:sz w:val="36"/>
-          <w:szCs w:val="36"/>
-        </w:rPr>
-        <w:t>Container</w:t>
-      </w:r>
-    </w:p>
-    <w:p>
-      <w:pPr>
-        <w:pStyle w:val="ListParagraph"/>
-        <w:numPr>
-          <w:ilvl w:val="0"/>
-          <w:numId w:val="21"/>
-        </w:numPr>
-        <w:jc w:val="both"/>
-        <w:rPr>
-          <w:sz w:val="36"/>
-          <w:szCs w:val="36"/>
-        </w:rPr>
-      </w:pPr>
-      <w:proofErr w:type="spellStart"/>
-      <w:r>
-        <w:rPr>
-          <w:b/>
-          <w:bCs/>
-          <w:sz w:val="36"/>
-          <w:szCs w:val="36"/>
-        </w:rPr>
-        <w:t>onChanged</w:t>
-      </w:r>
-      <w:proofErr w:type="spellEnd"/>
-      <w:r>
-        <w:rPr>
-          <w:sz w:val="36"/>
-          <w:szCs w:val="36"/>
-        </w:rPr>
-        <w:t xml:space="preserve"> </w:t>
-      </w:r>
-      <w:r>
-        <w:sym w:font="Wingdings" w:char="F0E0"/>
-      </w:r>
-      <w:r>
-        <w:rPr>
-          <w:b/>
-          <w:bCs/>
-          <w:sz w:val="36"/>
-          <w:szCs w:val="36"/>
-        </w:rPr>
-        <w:t xml:space="preserve"> </w:t>
-      </w:r>
-      <w:proofErr w:type="spellStart"/>
-      <w:r>
-        <w:rPr>
-          <w:b/>
-          <w:bCs/>
-          <w:sz w:val="36"/>
-          <w:szCs w:val="36"/>
-        </w:rPr>
-        <w:t>ValueChanged</w:t>
-      </w:r>
-      <w:proofErr w:type="spellEnd"/>
-      <w:r>
-        <w:rPr>
-          <w:b/>
-          <w:bCs/>
-          <w:sz w:val="36"/>
-          <w:szCs w:val="36"/>
-        </w:rPr>
-        <w:t>&lt;String&gt;</w:t>
-      </w:r>
-      <w:r>
-        <w:rPr>
-          <w:sz w:val="36"/>
-          <w:szCs w:val="36"/>
-        </w:rPr>
-        <w:t xml:space="preserve"> callback method that provides the changed value</w:t>
-      </w:r>
-    </w:p>
-    <w:p>
-      <w:pPr>
-        <w:jc w:val="both"/>
-        <w:rPr>
-          <w:sz w:val="36"/>
-          <w:szCs w:val="36"/>
-        </w:rPr>
-      </w:pPr>
-      <w:r>
-        <w:rPr>
-          <w:sz w:val="36"/>
-          <w:szCs w:val="36"/>
-        </w:rPr>
-        <w:t># Declare a nullable</w:t>
-      </w:r>
-      <w:r>
-        <w:rPr>
-          <w:b/>
-          <w:bCs/>
-          <w:sz w:val="36"/>
-          <w:szCs w:val="36"/>
-        </w:rPr>
-        <w:t xml:space="preserve"> </w:t>
-      </w:r>
-      <w:proofErr w:type="spellStart"/>
-      <w:r>
-        <w:rPr>
-          <w:b/>
-          <w:bCs/>
-          <w:sz w:val="36"/>
-          <w:szCs w:val="36"/>
-        </w:rPr>
-        <w:t>selectedValue</w:t>
-      </w:r>
-      <w:proofErr w:type="spellEnd"/>
-      <w:r>
-        <w:rPr>
-          <w:b/>
-          <w:bCs/>
-          <w:sz w:val="36"/>
-          <w:szCs w:val="36"/>
-        </w:rPr>
-        <w:t xml:space="preserve"> </w:t>
-      </w:r>
-      <w:r>
-        <w:rPr>
-          <w:sz w:val="36"/>
-          <w:szCs w:val="36"/>
-        </w:rPr>
-        <w:t xml:space="preserve">which will initialized in </w:t>
-      </w:r>
-      <w:proofErr w:type="spellStart"/>
-      <w:r>
-        <w:rPr>
-          <w:b/>
-          <w:bCs/>
-          <w:sz w:val="36"/>
-          <w:szCs w:val="36"/>
-        </w:rPr>
-        <w:t>initState</w:t>
-      </w:r>
-      <w:proofErr w:type="spellEnd"/>
-      <w:r>
-        <w:rPr>
-          <w:sz w:val="36"/>
-          <w:szCs w:val="36"/>
-        </w:rPr>
-        <w:t xml:space="preserve"> using</w:t>
-      </w:r>
-      <w:r>
-        <w:rPr>
-          <w:b/>
-          <w:bCs/>
-          <w:sz w:val="36"/>
-          <w:szCs w:val="36"/>
-        </w:rPr>
-        <w:t xml:space="preserve"> </w:t>
-      </w:r>
-      <w:proofErr w:type="spellStart"/>
-      <w:r>
-        <w:rPr>
-          <w:b/>
-          <w:bCs/>
-          <w:sz w:val="36"/>
-          <w:szCs w:val="36"/>
-        </w:rPr>
-        <w:t>initialValue</w:t>
-      </w:r>
-      <w:proofErr w:type="spellEnd"/>
-      <w:r>
-        <w:rPr>
-          <w:sz w:val="36"/>
-          <w:szCs w:val="36"/>
-        </w:rPr>
-        <w:t>.</w:t>
-      </w:r>
-    </w:p>
-    <w:p>
-      <w:pPr>
-        <w:jc w:val="both"/>
-        <w:rPr>
-          <w:b/>
-          <w:bCs/>
-          <w:sz w:val="36"/>
-          <w:szCs w:val="36"/>
-        </w:rPr>
-      </w:pPr>
-      <w:r>
-        <w:rPr>
-          <w:sz w:val="36"/>
-          <w:szCs w:val="36"/>
-        </w:rPr>
-        <w:t xml:space="preserve"># Then </w:t>
-      </w:r>
-      <w:r>
-        <w:rPr>
-          <w:sz w:val="36"/>
-          <w:szCs w:val="36"/>
-        </w:rPr>
-        <w:t xml:space="preserve">wrap the </w:t>
-      </w:r>
-      <w:proofErr w:type="spellStart"/>
-      <w:r>
-        <w:rPr>
-          <w:b/>
-          <w:bCs/>
-          <w:sz w:val="36"/>
-          <w:szCs w:val="36"/>
-        </w:rPr>
-        <w:t>ListView</w:t>
-      </w:r>
-      <w:proofErr w:type="spellEnd"/>
-      <w:r>
-        <w:rPr>
-          <w:b/>
-          <w:bCs/>
-          <w:sz w:val="36"/>
-          <w:szCs w:val="36"/>
-        </w:rPr>
-        <w:t xml:space="preserve"> </w:t>
-      </w:r>
-      <w:r>
-        <w:rPr>
-          <w:sz w:val="36"/>
-          <w:szCs w:val="36"/>
-        </w:rPr>
-        <w:t xml:space="preserve">with a </w:t>
-      </w:r>
-      <w:proofErr w:type="spellStart"/>
-      <w:r>
-        <w:rPr>
-          <w:b/>
-          <w:bCs/>
-          <w:sz w:val="36"/>
-          <w:szCs w:val="36"/>
-        </w:rPr>
-        <w:t>SizedBox</w:t>
-      </w:r>
-      <w:proofErr w:type="spellEnd"/>
-      <w:r>
-        <w:rPr>
-          <w:sz w:val="36"/>
-          <w:szCs w:val="36"/>
-        </w:rPr>
-        <w:t xml:space="preserve"> and set the height to </w:t>
-      </w:r>
-      <w:r>
-        <w:rPr>
-          <w:b/>
-          <w:bCs/>
-          <w:sz w:val="36"/>
-          <w:szCs w:val="36"/>
-        </w:rPr>
-        <w:t>40</w:t>
-      </w:r>
-      <w:r>
-        <w:rPr>
-          <w:sz w:val="36"/>
-          <w:szCs w:val="36"/>
-        </w:rPr>
-        <w:t xml:space="preserve">. </w:t>
-      </w:r>
-      <w:r>
-        <w:rPr>
-          <w:sz w:val="36"/>
-          <w:szCs w:val="36"/>
-        </w:rPr>
-        <w:t xml:space="preserve">Set the </w:t>
-      </w:r>
-      <w:proofErr w:type="spellStart"/>
-      <w:r>
-        <w:rPr>
-          <w:b/>
-          <w:bCs/>
-          <w:sz w:val="36"/>
-          <w:szCs w:val="36"/>
-        </w:rPr>
-        <w:t>scrollDirection</w:t>
-      </w:r>
-      <w:proofErr w:type="spellEnd"/>
-      <w:r>
-        <w:rPr>
-          <w:b/>
-          <w:bCs/>
-          <w:sz w:val="36"/>
-          <w:szCs w:val="36"/>
-        </w:rPr>
-        <w:t xml:space="preserve">: </w:t>
-      </w:r>
-      <w:r>
-        <w:rPr>
-          <w:sz w:val="36"/>
-          <w:szCs w:val="36"/>
-        </w:rPr>
-        <w:t xml:space="preserve">to </w:t>
-      </w:r>
-      <w:proofErr w:type="spellStart"/>
-      <w:r>
-        <w:rPr>
-          <w:b/>
-          <w:bCs/>
-          <w:sz w:val="36"/>
-          <w:szCs w:val="36"/>
-        </w:rPr>
-        <w:t>Axis.horizontal</w:t>
-      </w:r>
-      <w:proofErr w:type="spellEnd"/>
-    </w:p>
-    <w:p>
-      <w:pPr>
-        <w:jc w:val="both"/>
-        <w:rPr>
-          <w:sz w:val="36"/>
-          <w:szCs w:val="36"/>
-        </w:rPr>
-      </w:pPr>
-      <w:r>
-        <w:rPr>
-          <w:sz w:val="36"/>
-          <w:szCs w:val="36"/>
-        </w:rPr>
-        <w:t xml:space="preserve"># </w:t>
-      </w:r>
-      <w:proofErr w:type="spellStart"/>
-      <w:r>
-        <w:rPr>
-          <w:b/>
-          <w:bCs/>
-          <w:sz w:val="36"/>
-          <w:szCs w:val="36"/>
-        </w:rPr>
-        <w:t>itemCount</w:t>
-      </w:r>
-      <w:proofErr w:type="spellEnd"/>
-      <w:r>
-        <w:rPr>
-          <w:b/>
-          <w:bCs/>
-          <w:sz w:val="36"/>
-          <w:szCs w:val="36"/>
-        </w:rPr>
-        <w:t>:</w:t>
-      </w:r>
-      <w:r>
-        <w:rPr>
-          <w:sz w:val="36"/>
-          <w:szCs w:val="36"/>
-        </w:rPr>
-        <w:t xml:space="preserve"> property takes the length of the</w:t>
-      </w:r>
-      <w:r>
-        <w:rPr>
-          <w:b/>
-          <w:bCs/>
-          <w:sz w:val="36"/>
-          <w:szCs w:val="36"/>
-        </w:rPr>
-        <w:t xml:space="preserve"> colors</w:t>
-      </w:r>
-      <w:r>
-        <w:rPr>
-          <w:sz w:val="36"/>
-          <w:szCs w:val="36"/>
-        </w:rPr>
-        <w:t xml:space="preserve"> list.</w:t>
-      </w:r>
-    </w:p>
-    <w:p>
-      <w:pPr>
-        <w:jc w:val="both"/>
-        <w:rPr>
-          <w:sz w:val="36"/>
-          <w:szCs w:val="36"/>
-        </w:rPr>
-      </w:pPr>
-      <w:r>
-        <w:rPr>
-          <w:sz w:val="36"/>
-          <w:szCs w:val="36"/>
-        </w:rPr>
-        <w:t># Then assign the</w:t>
-      </w:r>
-      <w:r>
-        <w:rPr>
-          <w:b/>
-          <w:bCs/>
-          <w:sz w:val="36"/>
-          <w:szCs w:val="36"/>
-        </w:rPr>
-        <w:t xml:space="preserve"> color</w:t>
-      </w:r>
-      <w:r>
-        <w:rPr>
-          <w:sz w:val="36"/>
-          <w:szCs w:val="36"/>
-        </w:rPr>
-        <w:t xml:space="preserve"> </w:t>
-      </w:r>
-      <w:r>
-        <w:rPr>
-          <w:sz w:val="36"/>
-          <w:szCs w:val="36"/>
-        </w:rPr>
-        <w:t>according to the current</w:t>
-      </w:r>
-      <w:r>
-        <w:rPr>
-          <w:b/>
-          <w:bCs/>
-          <w:sz w:val="36"/>
-          <w:szCs w:val="36"/>
-        </w:rPr>
-        <w:t xml:space="preserve"> index</w:t>
-      </w:r>
-      <w:r>
-        <w:rPr>
-          <w:sz w:val="36"/>
-          <w:szCs w:val="36"/>
-        </w:rPr>
-        <w:t>. It will store the current element (</w:t>
-      </w:r>
-      <w:r>
-        <w:rPr>
-          <w:b/>
-          <w:bCs/>
-          <w:sz w:val="36"/>
-          <w:szCs w:val="36"/>
-        </w:rPr>
-        <w:t>String</w:t>
-      </w:r>
-      <w:r>
-        <w:rPr>
-          <w:sz w:val="36"/>
-          <w:szCs w:val="36"/>
-        </w:rPr>
-        <w:t xml:space="preserve">) of </w:t>
-      </w:r>
-      <w:r>
-        <w:rPr>
-          <w:sz w:val="36"/>
-          <w:szCs w:val="36"/>
-        </w:rPr>
-        <w:t xml:space="preserve">list. If it matches with the </w:t>
-      </w:r>
-      <w:proofErr w:type="spellStart"/>
-      <w:r>
-        <w:rPr>
-          <w:b/>
-          <w:bCs/>
-          <w:sz w:val="36"/>
-          <w:szCs w:val="36"/>
-        </w:rPr>
-        <w:t>selectedValue</w:t>
-      </w:r>
-      <w:proofErr w:type="spellEnd"/>
-      <w:r>
-        <w:rPr>
-          <w:sz w:val="36"/>
-          <w:szCs w:val="36"/>
-        </w:rPr>
-        <w:t xml:space="preserve"> then </w:t>
-      </w:r>
-      <w:proofErr w:type="spellStart"/>
-      <w:r>
-        <w:rPr>
-          <w:b/>
-          <w:bCs/>
-          <w:sz w:val="36"/>
-          <w:szCs w:val="36"/>
-        </w:rPr>
-        <w:t>isSelected</w:t>
-      </w:r>
-      <w:proofErr w:type="spellEnd"/>
-      <w:r>
-        <w:rPr>
-          <w:sz w:val="36"/>
-          <w:szCs w:val="36"/>
-        </w:rPr>
-        <w:t xml:space="preserve"> is </w:t>
-      </w:r>
-      <w:r>
-        <w:rPr>
-          <w:b/>
-          <w:bCs/>
-          <w:sz w:val="36"/>
-          <w:szCs w:val="36"/>
-        </w:rPr>
-        <w:t>true</w:t>
-      </w:r>
-      <w:r>
-        <w:rPr>
-          <w:sz w:val="36"/>
-          <w:szCs w:val="36"/>
-        </w:rPr>
-        <w:t>.</w:t>
-      </w:r>
-    </w:p>
-    <w:p>
-      <w:pPr>
-        <w:jc w:val="both"/>
-        <w:rPr>
-          <w:sz w:val="36"/>
-          <w:szCs w:val="36"/>
-        </w:rPr>
-      </w:pPr>
-      <w:r>
-        <w:rPr>
-          <w:sz w:val="36"/>
-          <w:szCs w:val="36"/>
-        </w:rPr>
-        <w:t xml:space="preserve"># </w:t>
-      </w:r>
-      <w:r>
-        <w:rPr>
-          <w:sz w:val="36"/>
-          <w:szCs w:val="36"/>
-        </w:rPr>
-        <w:t xml:space="preserve">In </w:t>
-      </w:r>
-      <w:proofErr w:type="spellStart"/>
-      <w:r>
-        <w:rPr>
-          <w:b/>
-          <w:bCs/>
-          <w:sz w:val="36"/>
-          <w:szCs w:val="36"/>
-        </w:rPr>
-        <w:t>GestureDetector</w:t>
-      </w:r>
-      <w:r>
-        <w:rPr>
-          <w:sz w:val="36"/>
-          <w:szCs w:val="36"/>
-        </w:rPr>
-        <w:t>’s</w:t>
-      </w:r>
-      <w:proofErr w:type="spellEnd"/>
-      <w:r>
-        <w:rPr>
-          <w:sz w:val="36"/>
-          <w:szCs w:val="36"/>
-        </w:rPr>
-        <w:t xml:space="preserve">, </w:t>
-      </w:r>
-      <w:proofErr w:type="spellStart"/>
-      <w:r>
-        <w:rPr>
-          <w:b/>
-          <w:bCs/>
-          <w:sz w:val="36"/>
-          <w:szCs w:val="36"/>
-        </w:rPr>
-        <w:t>onTap</w:t>
-      </w:r>
-      <w:proofErr w:type="spellEnd"/>
-      <w:r>
-        <w:rPr>
-          <w:b/>
-          <w:bCs/>
-          <w:sz w:val="36"/>
-          <w:szCs w:val="36"/>
-        </w:rPr>
-        <w:t xml:space="preserve">: </w:t>
-      </w:r>
-      <w:r>
-        <w:rPr>
-          <w:sz w:val="36"/>
-          <w:szCs w:val="36"/>
-        </w:rPr>
-        <w:t xml:space="preserve">callback method, sets the </w:t>
-      </w:r>
-      <w:proofErr w:type="spellStart"/>
-      <w:r>
-        <w:rPr>
-          <w:b/>
-          <w:bCs/>
-          <w:sz w:val="36"/>
-          <w:szCs w:val="36"/>
-        </w:rPr>
-        <w:t>selectedValue</w:t>
-      </w:r>
-      <w:proofErr w:type="spellEnd"/>
-      <w:r>
-        <w:rPr>
-          <w:sz w:val="36"/>
-          <w:szCs w:val="36"/>
-        </w:rPr>
-        <w:t xml:space="preserve"> to </w:t>
-      </w:r>
-      <w:r>
-        <w:rPr>
-          <w:b/>
-          <w:bCs/>
-          <w:sz w:val="36"/>
-          <w:szCs w:val="36"/>
-        </w:rPr>
-        <w:t xml:space="preserve">color </w:t>
-      </w:r>
-      <w:r>
-        <w:rPr>
-          <w:sz w:val="36"/>
-          <w:szCs w:val="36"/>
-        </w:rPr>
-        <w:t>(current index element). Which set</w:t>
-      </w:r>
-      <w:r>
-        <w:rPr>
-          <w:sz w:val="36"/>
-          <w:szCs w:val="36"/>
-        </w:rPr>
-        <w:t xml:space="preserve">s the </w:t>
-      </w:r>
-      <w:proofErr w:type="spellStart"/>
-      <w:r>
-        <w:rPr>
-          <w:b/>
-          <w:bCs/>
-          <w:sz w:val="36"/>
-          <w:szCs w:val="36"/>
-        </w:rPr>
-        <w:t>isSelected</w:t>
-      </w:r>
-      <w:proofErr w:type="spellEnd"/>
-      <w:r>
-        <w:rPr>
-          <w:sz w:val="36"/>
-          <w:szCs w:val="36"/>
-        </w:rPr>
-        <w:t xml:space="preserve"> to</w:t>
-      </w:r>
-      <w:r>
-        <w:rPr>
-          <w:b/>
-          <w:bCs/>
-          <w:sz w:val="36"/>
-          <w:szCs w:val="36"/>
-        </w:rPr>
-        <w:t xml:space="preserve"> true</w:t>
-      </w:r>
-      <w:r>
-        <w:rPr>
-          <w:sz w:val="36"/>
-          <w:szCs w:val="36"/>
-        </w:rPr>
-        <w:t xml:space="preserve"> or </w:t>
-      </w:r>
-      <w:r>
-        <w:rPr>
-          <w:b/>
-          <w:bCs/>
-          <w:sz w:val="36"/>
-          <w:szCs w:val="36"/>
-        </w:rPr>
-        <w:t>false</w:t>
-      </w:r>
-      <w:r>
-        <w:rPr>
-          <w:sz w:val="36"/>
-          <w:szCs w:val="36"/>
-        </w:rPr>
-        <w:t xml:space="preserve"> according to match</w:t>
-      </w:r>
-    </w:p>
-    <w:p>
-      <w:pPr>
-        <w:jc w:val="both"/>
-        <w:rPr>
-          <w:sz w:val="36"/>
-          <w:szCs w:val="36"/>
-        </w:rPr>
-      </w:pPr>
-      <w:r>
-        <w:rPr>
-          <w:sz w:val="36"/>
-          <w:szCs w:val="36"/>
-        </w:rPr>
-        <w:t xml:space="preserve"># Use the </w:t>
-      </w:r>
-      <w:proofErr w:type="spellStart"/>
-      <w:r>
-        <w:rPr>
-          <w:b/>
-          <w:bCs/>
-          <w:sz w:val="36"/>
-          <w:szCs w:val="36"/>
-        </w:rPr>
-        <w:t>isSelected</w:t>
-      </w:r>
-      <w:proofErr w:type="spellEnd"/>
-      <w:r>
-        <w:rPr>
-          <w:sz w:val="36"/>
-          <w:szCs w:val="36"/>
-        </w:rPr>
-        <w:t xml:space="preserve"> to control color and text color of the container. Use </w:t>
-      </w:r>
-      <w:r>
-        <w:rPr>
-          <w:b/>
-          <w:bCs/>
-          <w:sz w:val="36"/>
-          <w:szCs w:val="36"/>
-        </w:rPr>
-        <w:t>margin:</w:t>
-      </w:r>
-      <w:r>
-        <w:rPr>
-          <w:sz w:val="36"/>
-          <w:szCs w:val="36"/>
-        </w:rPr>
-        <w:t xml:space="preserve"> and </w:t>
-      </w:r>
-      <w:r>
-        <w:rPr>
-          <w:b/>
-          <w:bCs/>
-          <w:sz w:val="36"/>
-          <w:szCs w:val="36"/>
-        </w:rPr>
-        <w:t>padding:</w:t>
-      </w:r>
-      <w:r>
-        <w:rPr>
-          <w:sz w:val="36"/>
-          <w:szCs w:val="36"/>
-        </w:rPr>
-        <w:t xml:space="preserve"> property for more decoration.</w:t>
-      </w:r>
-    </w:p>
-    <w:p>
-      <w:pPr>
-        <w:jc w:val="both"/>
-        <w:rPr>
-          <w:sz w:val="36"/>
-          <w:szCs w:val="36"/>
-        </w:rPr>
-      </w:pPr>
-      <w:r>
-        <w:rPr>
-          <w:sz w:val="36"/>
-          <w:szCs w:val="36"/>
-        </w:rPr>
-        <w:t xml:space="preserve">NOTE: We use </w:t>
-      </w:r>
-      <w:r>
-        <w:rPr>
-          <w:b/>
-          <w:bCs/>
-          <w:sz w:val="36"/>
-          <w:szCs w:val="36"/>
-        </w:rPr>
-        <w:t>Row</w:t>
-      </w:r>
-      <w:r>
-        <w:rPr>
-          <w:sz w:val="36"/>
-          <w:szCs w:val="36"/>
-        </w:rPr>
-        <w:t xml:space="preserve"> with </w:t>
-      </w:r>
-      <w:r>
-        <w:rPr>
-          <w:b/>
-          <w:bCs/>
-          <w:sz w:val="36"/>
-          <w:szCs w:val="36"/>
-        </w:rPr>
-        <w:t>for</w:t>
-      </w:r>
-      <w:r>
-        <w:rPr>
-          <w:sz w:val="36"/>
-          <w:szCs w:val="36"/>
-        </w:rPr>
-        <w:t xml:space="preserve"> loop and </w:t>
-      </w:r>
-      <w:r>
-        <w:rPr>
-          <w:b/>
-          <w:bCs/>
-          <w:sz w:val="36"/>
-          <w:szCs w:val="36"/>
-        </w:rPr>
-        <w:t>Container</w:t>
-      </w:r>
-      <w:r>
-        <w:rPr>
-          <w:sz w:val="36"/>
-          <w:szCs w:val="36"/>
-        </w:rPr>
-        <w:t xml:space="preserve"> for </w:t>
-      </w:r>
-      <w:proofErr w:type="spellStart"/>
-      <w:r>
-        <w:rPr>
-          <w:b/>
-          <w:bCs/>
-          <w:sz w:val="36"/>
-          <w:szCs w:val="36"/>
-        </w:rPr>
-        <w:t>CarouselSlider</w:t>
-      </w:r>
-      <w:proofErr w:type="spellEnd"/>
-      <w:r>
-        <w:rPr>
-          <w:b/>
-          <w:bCs/>
-          <w:sz w:val="36"/>
-          <w:szCs w:val="36"/>
-        </w:rPr>
-        <w:t xml:space="preserve"> </w:t>
-      </w:r>
-      <w:r>
-        <w:rPr>
-          <w:sz w:val="36"/>
-          <w:szCs w:val="36"/>
-        </w:rPr>
-        <w:t>widgets effect.</w:t>
-      </w:r>
-    </w:p>
-    <w:p>
-      <w:pPr>
-        <w:jc w:val="both"/>
-        <w:rPr>
-          <w:b/>
-          <w:bCs/>
-          <w:color w:val="D86DCB" w:themeColor="accent5" w:themeTint="99"/>
-          <w:sz w:val="36"/>
-          <w:szCs w:val="36"/>
-        </w:rPr>
-      </w:pPr>
-      <w:r>
-        <w:rPr>
-          <w:b/>
-          <w:bCs/>
-          <w:color w:val="D86DCB" w:themeColor="accent5" w:themeTint="99"/>
-          <w:sz w:val="36"/>
-          <w:szCs w:val="36"/>
-        </w:rPr>
-        <w:t xml:space="preserve">class </w:t>
-      </w:r>
-      <w:proofErr w:type="spellStart"/>
-      <w:r>
-        <w:rPr>
-          <w:b/>
-          <w:bCs/>
-          <w:color w:val="D86DCB" w:themeColor="accent5" w:themeTint="99"/>
-          <w:sz w:val="36"/>
-          <w:szCs w:val="36"/>
-        </w:rPr>
-        <w:t>ColorPicker</w:t>
-      </w:r>
-      <w:proofErr w:type="spellEnd"/>
-      <w:r>
-        <w:rPr>
-          <w:b/>
-          <w:bCs/>
-          <w:color w:val="D86DCB" w:themeColor="accent5" w:themeTint="99"/>
-          <w:sz w:val="36"/>
-          <w:szCs w:val="36"/>
-        </w:rPr>
-        <w:t xml:space="preserve"> extends </w:t>
-      </w:r>
-      <w:proofErr w:type="spellStart"/>
-      <w:r>
-        <w:rPr>
-          <w:b/>
-          <w:bCs/>
-          <w:color w:val="D86DCB" w:themeColor="accent5" w:themeTint="99"/>
-          <w:sz w:val="36"/>
-          <w:szCs w:val="36"/>
-        </w:rPr>
-        <w:t>StatefulWidget</w:t>
-      </w:r>
-      <w:proofErr w:type="spellEnd"/>
-      <w:r>
-        <w:rPr>
-          <w:b/>
-          <w:bCs/>
-          <w:color w:val="D86DCB" w:themeColor="accent5" w:themeTint="99"/>
-          <w:sz w:val="36"/>
-          <w:szCs w:val="36"/>
-        </w:rPr>
-        <w:t xml:space="preserve"> {</w:t>
-      </w:r>
-    </w:p>
-    <w:p>
-      <w:pPr>
-        <w:jc w:val="both"/>
-        <w:rPr>
-          <w:b/>
-          <w:bCs/>
-          <w:color w:val="D86DCB" w:themeColor="accent5" w:themeTint="99"/>
-          <w:sz w:val="36"/>
-          <w:szCs w:val="36"/>
-        </w:rPr>
-      </w:pPr>
-      <w:r>
-        <w:rPr>
-          <w:b/>
-          <w:bCs/>
-          <w:color w:val="D86DCB" w:themeColor="accent5" w:themeTint="99"/>
-          <w:sz w:val="36"/>
-          <w:szCs w:val="36"/>
-        </w:rPr>
-        <w:lastRenderedPageBreak/>
-        <w:t xml:space="preserve">  const </w:t>
-      </w:r>
-      <w:proofErr w:type="spellStart"/>
-      <w:proofErr w:type="gramStart"/>
-      <w:r>
-        <w:rPr>
-          <w:b/>
-          <w:bCs/>
-          <w:color w:val="D86DCB" w:themeColor="accent5" w:themeTint="99"/>
-          <w:sz w:val="36"/>
-          <w:szCs w:val="36"/>
-        </w:rPr>
-        <w:t>ColorPicker</w:t>
-      </w:r>
-      <w:proofErr w:type="spellEnd"/>
-      <w:r>
-        <w:rPr>
-          <w:b/>
-          <w:bCs/>
-          <w:color w:val="D86DCB" w:themeColor="accent5" w:themeTint="99"/>
-          <w:sz w:val="36"/>
-          <w:szCs w:val="36"/>
-        </w:rPr>
-        <w:t>(</w:t>
-      </w:r>
-      <w:proofErr w:type="gramEnd"/>
-      <w:r>
-        <w:rPr>
-          <w:b/>
-          <w:bCs/>
-          <w:color w:val="D86DCB" w:themeColor="accent5" w:themeTint="99"/>
-          <w:sz w:val="36"/>
-          <w:szCs w:val="36"/>
-        </w:rPr>
-        <w:t>{</w:t>
-      </w:r>
-      <w:proofErr w:type="spellStart"/>
-      <w:r>
-        <w:rPr>
-          <w:b/>
-          <w:bCs/>
-          <w:color w:val="D86DCB" w:themeColor="accent5" w:themeTint="99"/>
-          <w:sz w:val="36"/>
-          <w:szCs w:val="36"/>
-        </w:rPr>
-        <w:t>super.key</w:t>
-      </w:r>
-      <w:proofErr w:type="spellEnd"/>
-      <w:r>
-        <w:rPr>
-          <w:b/>
-          <w:bCs/>
-          <w:color w:val="D86DCB" w:themeColor="accent5" w:themeTint="99"/>
-          <w:sz w:val="36"/>
-          <w:szCs w:val="36"/>
-        </w:rPr>
-        <w:t xml:space="preserve">, required </w:t>
-      </w:r>
-      <w:proofErr w:type="spellStart"/>
-      <w:r>
-        <w:rPr>
-          <w:b/>
-          <w:bCs/>
-          <w:color w:val="D86DCB" w:themeColor="accent5" w:themeTint="99"/>
-          <w:sz w:val="36"/>
-          <w:szCs w:val="36"/>
-        </w:rPr>
-        <w:t>this.initialValue</w:t>
-      </w:r>
-      <w:proofErr w:type="spellEnd"/>
-      <w:r>
-        <w:rPr>
-          <w:b/>
-          <w:bCs/>
-          <w:color w:val="D86DCB" w:themeColor="accent5" w:themeTint="99"/>
-          <w:sz w:val="36"/>
-          <w:szCs w:val="36"/>
-        </w:rPr>
-        <w:t xml:space="preserve">, required </w:t>
-      </w:r>
-      <w:proofErr w:type="spellStart"/>
-      <w:r>
-        <w:rPr>
-          <w:b/>
-          <w:bCs/>
-          <w:color w:val="D86DCB" w:themeColor="accent5" w:themeTint="99"/>
-          <w:sz w:val="36"/>
-          <w:szCs w:val="36"/>
-        </w:rPr>
-        <w:t>this.colors</w:t>
-      </w:r>
-      <w:proofErr w:type="spellEnd"/>
-      <w:r>
-        <w:rPr>
-          <w:b/>
-          <w:bCs/>
-          <w:color w:val="D86DCB" w:themeColor="accent5" w:themeTint="99"/>
-          <w:sz w:val="36"/>
-          <w:szCs w:val="36"/>
-        </w:rPr>
-        <w:t xml:space="preserve">, required </w:t>
-      </w:r>
-      <w:proofErr w:type="spellStart"/>
-      <w:r>
-        <w:rPr>
-          <w:b/>
-          <w:bCs/>
-          <w:color w:val="D86DCB" w:themeColor="accent5" w:themeTint="99"/>
-          <w:sz w:val="36"/>
-          <w:szCs w:val="36"/>
-        </w:rPr>
-        <w:t>this.onChanged</w:t>
-      </w:r>
-      <w:proofErr w:type="spellEnd"/>
-      <w:r>
-        <w:rPr>
-          <w:b/>
-          <w:bCs/>
-          <w:color w:val="D86DCB" w:themeColor="accent5" w:themeTint="99"/>
-          <w:sz w:val="36"/>
-          <w:szCs w:val="36"/>
-        </w:rPr>
-        <w:t>});</w:t>
-      </w:r>
-    </w:p>
-    <w:p>
-      <w:pPr>
-        <w:jc w:val="both"/>
-        <w:rPr>
-          <w:b/>
-          <w:bCs/>
-          <w:color w:val="D86DCB" w:themeColor="accent5" w:themeTint="99"/>
-          <w:sz w:val="36"/>
-          <w:szCs w:val="36"/>
-        </w:rPr>
-      </w:pPr>
-      <w:r>
-        <w:rPr>
-          <w:b/>
-          <w:bCs/>
-          <w:color w:val="D86DCB" w:themeColor="accent5" w:themeTint="99"/>
-          <w:sz w:val="36"/>
-          <w:szCs w:val="36"/>
-        </w:rPr>
-        <w:t xml:space="preserve">  final String </w:t>
-      </w:r>
-      <w:proofErr w:type="spellStart"/>
-      <w:r>
-        <w:rPr>
-          <w:b/>
-          <w:bCs/>
-          <w:color w:val="D86DCB" w:themeColor="accent5" w:themeTint="99"/>
-          <w:sz w:val="36"/>
-          <w:szCs w:val="36"/>
-        </w:rPr>
-        <w:t>initialValue</w:t>
-      </w:r>
-      <w:proofErr w:type="spellEnd"/>
-      <w:r>
-        <w:rPr>
-          <w:b/>
-          <w:bCs/>
-          <w:color w:val="D86DCB" w:themeColor="accent5" w:themeTint="99"/>
-          <w:sz w:val="36"/>
-          <w:szCs w:val="36"/>
-        </w:rPr>
-        <w:t>;</w:t>
-      </w:r>
-    </w:p>
-    <w:p>
-      <w:pPr>
-        <w:jc w:val="both"/>
-        <w:rPr>
-          <w:b/>
-          <w:bCs/>
-          <w:color w:val="D86DCB" w:themeColor="accent5" w:themeTint="99"/>
-          <w:sz w:val="36"/>
-          <w:szCs w:val="36"/>
-        </w:rPr>
-      </w:pPr>
-      <w:r>
-        <w:rPr>
-          <w:b/>
-          <w:bCs/>
-          <w:color w:val="D86DCB" w:themeColor="accent5" w:themeTint="99"/>
-          <w:sz w:val="36"/>
-          <w:szCs w:val="36"/>
-        </w:rPr>
-        <w:t xml:space="preserve">  final List&lt;String&gt; colors;</w:t>
-      </w:r>
-    </w:p>
-    <w:p>
-      <w:pPr>
-        <w:jc w:val="both"/>
-        <w:rPr>
-          <w:b/>
-          <w:bCs/>
-          <w:color w:val="D86DCB" w:themeColor="accent5" w:themeTint="99"/>
-          <w:sz w:val="36"/>
-          <w:szCs w:val="36"/>
-        </w:rPr>
-      </w:pPr>
-      <w:r>
-        <w:rPr>
-          <w:b/>
-          <w:bCs/>
-          <w:color w:val="D86DCB" w:themeColor="accent5" w:themeTint="99"/>
-          <w:sz w:val="36"/>
-          <w:szCs w:val="36"/>
-        </w:rPr>
-        <w:t xml:space="preserve">  final </w:t>
-      </w:r>
-      <w:proofErr w:type="spellStart"/>
-      <w:r>
-        <w:rPr>
-          <w:b/>
-          <w:bCs/>
-          <w:color w:val="D86DCB" w:themeColor="accent5" w:themeTint="99"/>
-          <w:sz w:val="36"/>
-          <w:szCs w:val="36"/>
-        </w:rPr>
-        <w:t>ValueChanged</w:t>
-      </w:r>
-      <w:proofErr w:type="spellEnd"/>
-      <w:r>
-        <w:rPr>
-          <w:b/>
-          <w:bCs/>
-          <w:color w:val="D86DCB" w:themeColor="accent5" w:themeTint="99"/>
-          <w:sz w:val="36"/>
-          <w:szCs w:val="36"/>
-        </w:rPr>
-        <w:t xml:space="preserve">&lt;String&gt; </w:t>
-      </w:r>
-      <w:proofErr w:type="spellStart"/>
-      <w:r>
-        <w:rPr>
-          <w:b/>
-          <w:bCs/>
-          <w:color w:val="D86DCB" w:themeColor="accent5" w:themeTint="99"/>
-          <w:sz w:val="36"/>
-          <w:szCs w:val="36"/>
-        </w:rPr>
-        <w:t>onChanged</w:t>
-      </w:r>
-      <w:proofErr w:type="spellEnd"/>
-      <w:r>
-        <w:rPr>
-          <w:b/>
-          <w:bCs/>
-          <w:color w:val="D86DCB" w:themeColor="accent5" w:themeTint="99"/>
-          <w:sz w:val="36"/>
-          <w:szCs w:val="36"/>
-        </w:rPr>
-        <w:t>;</w:t>
-      </w:r>
-    </w:p>
-    <w:p>
-      <w:pPr>
-        <w:jc w:val="both"/>
-        <w:rPr>
-          <w:b/>
-          <w:bCs/>
-          <w:color w:val="D86DCB" w:themeColor="accent5" w:themeTint="99"/>
-          <w:sz w:val="36"/>
-          <w:szCs w:val="36"/>
-        </w:rPr>
-      </w:pPr>
-      <w:r>
-        <w:rPr>
-          <w:b/>
-          <w:bCs/>
-          <w:color w:val="D86DCB" w:themeColor="accent5" w:themeTint="99"/>
-          <w:sz w:val="36"/>
-          <w:szCs w:val="36"/>
-        </w:rPr>
-        <w:t xml:space="preserve">  @override</w:t>
-      </w:r>
-    </w:p>
-    <w:p>
-      <w:pPr>
-        <w:jc w:val="both"/>
-        <w:rPr>
-          <w:b/>
-          <w:bCs/>
-          <w:color w:val="D86DCB" w:themeColor="accent5" w:themeTint="99"/>
-          <w:sz w:val="36"/>
-          <w:szCs w:val="36"/>
-        </w:rPr>
-      </w:pPr>
-      <w:r>
-        <w:rPr>
-          <w:b/>
-          <w:bCs/>
-          <w:color w:val="D86DCB" w:themeColor="accent5" w:themeTint="99"/>
-          <w:sz w:val="36"/>
-          <w:szCs w:val="36"/>
-        </w:rPr>
-        <w:t xml:space="preserve">  State&lt;</w:t>
-      </w:r>
-      <w:proofErr w:type="spellStart"/>
-      <w:r>
-        <w:rPr>
-          <w:b/>
-          <w:bCs/>
-          <w:color w:val="D86DCB" w:themeColor="accent5" w:themeTint="99"/>
-          <w:sz w:val="36"/>
-          <w:szCs w:val="36"/>
-        </w:rPr>
-        <w:t>ColorPicker</w:t>
-      </w:r>
-      <w:proofErr w:type="spellEnd"/>
-      <w:r>
-        <w:rPr>
-          <w:b/>
-          <w:bCs/>
-          <w:color w:val="D86DCB" w:themeColor="accent5" w:themeTint="99"/>
-          <w:sz w:val="36"/>
-          <w:szCs w:val="36"/>
-        </w:rPr>
-        <w:t xml:space="preserve">&gt; </w:t>
-      </w:r>
-      <w:proofErr w:type="spellStart"/>
-      <w:proofErr w:type="gramStart"/>
-      <w:r>
-        <w:rPr>
-          <w:b/>
-          <w:bCs/>
-          <w:color w:val="D86DCB" w:themeColor="accent5" w:themeTint="99"/>
-          <w:sz w:val="36"/>
-          <w:szCs w:val="36"/>
-        </w:rPr>
-        <w:t>createState</w:t>
-      </w:r>
-      <w:proofErr w:type="spellEnd"/>
-      <w:r>
-        <w:rPr>
-          <w:b/>
-          <w:bCs/>
-          <w:color w:val="D86DCB" w:themeColor="accent5" w:themeTint="99"/>
-          <w:sz w:val="36"/>
-          <w:szCs w:val="36"/>
-        </w:rPr>
-        <w:t>(</w:t>
-      </w:r>
-      <w:proofErr w:type="gramEnd"/>
-      <w:r>
-        <w:rPr>
-          <w:b/>
-          <w:bCs/>
-          <w:color w:val="D86DCB" w:themeColor="accent5" w:themeTint="99"/>
-          <w:sz w:val="36"/>
-          <w:szCs w:val="36"/>
-        </w:rPr>
-        <w:t>) =&gt; _</w:t>
-      </w:r>
-      <w:proofErr w:type="spellStart"/>
-      <w:r>
-        <w:rPr>
-          <w:b/>
-          <w:bCs/>
-          <w:color w:val="D86DCB" w:themeColor="accent5" w:themeTint="99"/>
-          <w:sz w:val="36"/>
-          <w:szCs w:val="36"/>
-        </w:rPr>
-        <w:t>ColorPickerState</w:t>
-      </w:r>
-      <w:proofErr w:type="spellEnd"/>
-      <w:r>
-        <w:rPr>
-          <w:b/>
-          <w:bCs/>
-          <w:color w:val="D86DCB" w:themeColor="accent5" w:themeTint="99"/>
-          <w:sz w:val="36"/>
-          <w:szCs w:val="36"/>
-        </w:rPr>
-        <w:t>();</w:t>
-      </w:r>
-    </w:p>
-    <w:p>
-      <w:pPr>
-        <w:jc w:val="both"/>
-        <w:rPr>
-          <w:b/>
-          <w:bCs/>
-          <w:color w:val="D86DCB" w:themeColor="accent5" w:themeTint="99"/>
-          <w:sz w:val="36"/>
-          <w:szCs w:val="36"/>
-        </w:rPr>
-      </w:pPr>
-      <w:r>
-        <w:rPr>
-          <w:b/>
-          <w:bCs/>
-          <w:color w:val="D86DCB" w:themeColor="accent5" w:themeTint="99"/>
-          <w:sz w:val="36"/>
-          <w:szCs w:val="36"/>
-        </w:rPr>
-        <w:t>}</w:t>
-      </w:r>
-    </w:p>
-    <w:p>
-      <w:pPr>
-        <w:jc w:val="both"/>
-        <w:rPr>
-          <w:b/>
-          <w:bCs/>
-          <w:color w:val="D86DCB" w:themeColor="accent5" w:themeTint="99"/>
-          <w:sz w:val="36"/>
-          <w:szCs w:val="36"/>
-        </w:rPr>
-      </w:pPr>
-      <w:r>
-        <w:rPr>
-          <w:b/>
-          <w:bCs/>
-          <w:color w:val="D86DCB" w:themeColor="accent5" w:themeTint="99"/>
-          <w:sz w:val="36"/>
-          <w:szCs w:val="36"/>
-        </w:rPr>
-        <w:t>class _</w:t>
-      </w:r>
-      <w:proofErr w:type="spellStart"/>
-      <w:r>
-        <w:rPr>
-          <w:b/>
-          <w:bCs/>
-          <w:color w:val="D86DCB" w:themeColor="accent5" w:themeTint="99"/>
-          <w:sz w:val="36"/>
-          <w:szCs w:val="36"/>
-        </w:rPr>
-        <w:t>ColorPickerState</w:t>
-      </w:r>
-      <w:proofErr w:type="spellEnd"/>
-      <w:r>
-        <w:rPr>
-          <w:b/>
-          <w:bCs/>
-          <w:color w:val="D86DCB" w:themeColor="accent5" w:themeTint="99"/>
-          <w:sz w:val="36"/>
-          <w:szCs w:val="36"/>
-        </w:rPr>
-        <w:t xml:space="preserve"> extends State&lt;</w:t>
-      </w:r>
-      <w:proofErr w:type="spellStart"/>
-      <w:r>
-        <w:rPr>
-          <w:b/>
-          <w:bCs/>
-          <w:color w:val="D86DCB" w:themeColor="accent5" w:themeTint="99"/>
-          <w:sz w:val="36"/>
-          <w:szCs w:val="36"/>
-        </w:rPr>
-        <w:t>ColorPicker</w:t>
-      </w:r>
-      <w:proofErr w:type="spellEnd"/>
-      <w:r>
-        <w:rPr>
-          <w:b/>
-          <w:bCs/>
-          <w:color w:val="D86DCB" w:themeColor="accent5" w:themeTint="99"/>
-          <w:sz w:val="36"/>
-          <w:szCs w:val="36"/>
-        </w:rPr>
-        <w:t>&gt; {</w:t>
-      </w:r>
-    </w:p>
-    <w:p>
-      <w:pPr>
-        <w:jc w:val="both"/>
-        <w:rPr>
-          <w:b/>
-          <w:bCs/>
-          <w:color w:val="D86DCB" w:themeColor="accent5" w:themeTint="99"/>
-          <w:sz w:val="36"/>
-          <w:szCs w:val="36"/>
-        </w:rPr>
-      </w:pPr>
-      <w:r>
-        <w:rPr>
-          <w:b/>
-          <w:bCs/>
-          <w:color w:val="D86DCB" w:themeColor="accent5" w:themeTint="99"/>
-          <w:sz w:val="36"/>
-          <w:szCs w:val="36"/>
-        </w:rPr>
-        <w:t xml:space="preserve">  String? </w:t>
-      </w:r>
-      <w:proofErr w:type="spellStart"/>
-      <w:r>
-        <w:rPr>
-          <w:b/>
-          <w:bCs/>
-          <w:color w:val="D86DCB" w:themeColor="accent5" w:themeTint="99"/>
-          <w:sz w:val="36"/>
-          <w:szCs w:val="36"/>
-        </w:rPr>
-        <w:t>selectedValue</w:t>
-      </w:r>
-      <w:proofErr w:type="spellEnd"/>
-      <w:r>
-        <w:rPr>
-          <w:b/>
-          <w:bCs/>
-          <w:color w:val="D86DCB" w:themeColor="accent5" w:themeTint="99"/>
-          <w:sz w:val="36"/>
-          <w:szCs w:val="36"/>
-        </w:rPr>
-        <w:t>;</w:t>
-      </w:r>
-    </w:p>
-    <w:p>
-      <w:pPr>
-        <w:jc w:val="both"/>
-        <w:rPr>
-          <w:b/>
-          <w:bCs/>
-          <w:color w:val="D86DCB" w:themeColor="accent5" w:themeTint="99"/>
-          <w:sz w:val="36"/>
-          <w:szCs w:val="36"/>
-        </w:rPr>
-      </w:pPr>
-      <w:r>
-        <w:rPr>
-          <w:b/>
-          <w:bCs/>
-          <w:color w:val="D86DCB" w:themeColor="accent5" w:themeTint="99"/>
-          <w:sz w:val="36"/>
-          <w:szCs w:val="36"/>
-        </w:rPr>
-        <w:t xml:space="preserve">  @override</w:t>
-      </w:r>
-    </w:p>
-    <w:p>
-      <w:pPr>
-        <w:jc w:val="both"/>
-        <w:rPr>
-          <w:b/>
-          <w:bCs/>
-          <w:color w:val="D86DCB" w:themeColor="accent5" w:themeTint="99"/>
-          <w:sz w:val="36"/>
-          <w:szCs w:val="36"/>
-        </w:rPr>
-      </w:pPr>
-      <w:r>
-        <w:rPr>
-          <w:b/>
-          <w:bCs/>
-          <w:color w:val="D86DCB" w:themeColor="accent5" w:themeTint="99"/>
-          <w:sz w:val="36"/>
-          <w:szCs w:val="36"/>
-        </w:rPr>
-        <w:t xml:space="preserve">  void </w:t>
-      </w:r>
-      <w:proofErr w:type="spellStart"/>
-      <w:proofErr w:type="gramStart"/>
-      <w:r>
-        <w:rPr>
-          <w:b/>
-          <w:bCs/>
-          <w:color w:val="D86DCB" w:themeColor="accent5" w:themeTint="99"/>
-          <w:sz w:val="36"/>
-          <w:szCs w:val="36"/>
-        </w:rPr>
-        <w:t>initState</w:t>
-      </w:r>
-      <w:proofErr w:type="spellEnd"/>
-      <w:r>
-        <w:rPr>
-          <w:b/>
-          <w:bCs/>
-          <w:color w:val="D86DCB" w:themeColor="accent5" w:themeTint="99"/>
-          <w:sz w:val="36"/>
-          <w:szCs w:val="36"/>
-        </w:rPr>
-        <w:t>(</w:t>
-      </w:r>
-      <w:proofErr w:type="gramEnd"/>
-      <w:r>
-        <w:rPr>
-          <w:b/>
-          <w:bCs/>
-          <w:color w:val="D86DCB" w:themeColor="accent5" w:themeTint="99"/>
-          <w:sz w:val="36"/>
-          <w:szCs w:val="36"/>
-        </w:rPr>
-        <w:t>) {</w:t>
-      </w:r>
-    </w:p>
-    <w:p>
-      <w:pPr>
-        <w:jc w:val="both"/>
-        <w:rPr>
-          <w:b/>
-          <w:bCs/>
-          <w:color w:val="D86DCB" w:themeColor="accent5" w:themeTint="99"/>
-          <w:sz w:val="36"/>
-          <w:szCs w:val="36"/>
-        </w:rPr>
-      </w:pPr>
-      <w:r>
-        <w:rPr>
-          <w:b/>
-          <w:bCs/>
-          <w:color w:val="D86DCB" w:themeColor="accent5" w:themeTint="99"/>
-          <w:sz w:val="36"/>
-          <w:szCs w:val="36"/>
-        </w:rPr>
-        <w:t xml:space="preserve">    </w:t>
-      </w:r>
-      <w:proofErr w:type="spellStart"/>
-      <w:proofErr w:type="gramStart"/>
-      <w:r>
-        <w:rPr>
-          <w:b/>
-          <w:bCs/>
-          <w:color w:val="D86DCB" w:themeColor="accent5" w:themeTint="99"/>
-          <w:sz w:val="36"/>
-          <w:szCs w:val="36"/>
-        </w:rPr>
-        <w:t>super.initState</w:t>
-      </w:r>
-      <w:proofErr w:type="spellEnd"/>
-      <w:proofErr w:type="gramEnd"/>
-      <w:r>
-        <w:rPr>
-          <w:b/>
-          <w:bCs/>
-          <w:color w:val="D86DCB" w:themeColor="accent5" w:themeTint="99"/>
-          <w:sz w:val="36"/>
-          <w:szCs w:val="36"/>
-        </w:rPr>
-        <w:t>();</w:t>
-      </w:r>
-    </w:p>
-    <w:p>
-      <w:pPr>
-        <w:jc w:val="both"/>
-        <w:rPr>
-          <w:b/>
-          <w:bCs/>
-          <w:color w:val="D86DCB" w:themeColor="accent5" w:themeTint="99"/>
-          <w:sz w:val="36"/>
-          <w:szCs w:val="36"/>
-        </w:rPr>
-      </w:pPr>
-      <w:r>
-        <w:rPr>
-          <w:b/>
-          <w:bCs/>
-          <w:color w:val="D86DCB" w:themeColor="accent5" w:themeTint="99"/>
-          <w:sz w:val="36"/>
-          <w:szCs w:val="36"/>
-        </w:rPr>
-        <w:t xml:space="preserve">    </w:t>
-      </w:r>
-      <w:proofErr w:type="spellStart"/>
-      <w:r>
-        <w:rPr>
-          <w:b/>
-          <w:bCs/>
-          <w:color w:val="D86DCB" w:themeColor="accent5" w:themeTint="99"/>
-          <w:sz w:val="36"/>
-          <w:szCs w:val="36"/>
-        </w:rPr>
-        <w:t>selectedValue</w:t>
-      </w:r>
-      <w:proofErr w:type="spellEnd"/>
-      <w:r>
-        <w:rPr>
-          <w:b/>
-          <w:bCs/>
-          <w:color w:val="D86DCB" w:themeColor="accent5" w:themeTint="99"/>
-          <w:sz w:val="36"/>
-          <w:szCs w:val="36"/>
-        </w:rPr>
-        <w:t xml:space="preserve"> = </w:t>
-      </w:r>
-      <w:proofErr w:type="spellStart"/>
-      <w:proofErr w:type="gramStart"/>
-      <w:r>
-        <w:rPr>
-          <w:b/>
-          <w:bCs/>
-          <w:color w:val="D86DCB" w:themeColor="accent5" w:themeTint="99"/>
-          <w:sz w:val="36"/>
-          <w:szCs w:val="36"/>
-        </w:rPr>
-        <w:t>widget.initialValue</w:t>
-      </w:r>
-      <w:proofErr w:type="spellEnd"/>
-      <w:proofErr w:type="gramEnd"/>
-      <w:r>
-        <w:rPr>
-          <w:b/>
-          <w:bCs/>
-          <w:color w:val="D86DCB" w:themeColor="accent5" w:themeTint="99"/>
-          <w:sz w:val="36"/>
-          <w:szCs w:val="36"/>
-        </w:rPr>
-        <w:t>;</w:t>
-      </w:r>
-    </w:p>
-    <w:p>
-      <w:pPr>
-        <w:jc w:val="both"/>
-        <w:rPr>
-          <w:b/>
-          <w:bCs/>
-          <w:color w:val="D86DCB" w:themeColor="accent5" w:themeTint="99"/>
-          <w:sz w:val="36"/>
-          <w:szCs w:val="36"/>
-        </w:rPr>
-      </w:pPr>
-      <w:r>
-        <w:rPr>
-          <w:b/>
-          <w:bCs/>
-          <w:color w:val="D86DCB" w:themeColor="accent5" w:themeTint="99"/>
-          <w:sz w:val="36"/>
-          <w:szCs w:val="36"/>
-        </w:rPr>
-        <w:t xml:space="preserve">  }</w:t>
-      </w:r>
-    </w:p>
-    <w:p>
-      <w:pPr>
-        <w:jc w:val="both"/>
-        <w:rPr>
-          <w:b/>
-          <w:bCs/>
-          <w:color w:val="D86DCB" w:themeColor="accent5" w:themeTint="99"/>
-          <w:sz w:val="36"/>
-          <w:szCs w:val="36"/>
-        </w:rPr>
-      </w:pPr>
-      <w:r>
-        <w:rPr>
-          <w:b/>
-          <w:bCs/>
-          <w:color w:val="D86DCB" w:themeColor="accent5" w:themeTint="99"/>
-          <w:sz w:val="36"/>
-          <w:szCs w:val="36"/>
-        </w:rPr>
-        <w:t xml:space="preserve">  @override</w:t>
-      </w:r>
-    </w:p>
-    <w:p>
-      <w:pPr>
-        <w:jc w:val="both"/>
-        <w:rPr>
-          <w:b/>
-          <w:bCs/>
-          <w:color w:val="D86DCB" w:themeColor="accent5" w:themeTint="99"/>
-          <w:sz w:val="36"/>
-          <w:szCs w:val="36"/>
-        </w:rPr>
-      </w:pPr>
-      <w:r>
-        <w:rPr>
-          <w:b/>
-          <w:bCs/>
-          <w:color w:val="D86DCB" w:themeColor="accent5" w:themeTint="99"/>
-          <w:sz w:val="36"/>
-          <w:szCs w:val="36"/>
-        </w:rPr>
-        <w:t xml:space="preserve">  Widget </w:t>
-      </w:r>
-      <w:proofErr w:type="gramStart"/>
-      <w:r>
-        <w:rPr>
-          <w:b/>
-          <w:bCs/>
-          <w:color w:val="D86DCB" w:themeColor="accent5" w:themeTint="99"/>
-          <w:sz w:val="36"/>
-          <w:szCs w:val="36"/>
-        </w:rPr>
-        <w:t>build(</w:t>
-      </w:r>
-      <w:proofErr w:type="spellStart"/>
-      <w:proofErr w:type="gramEnd"/>
-      <w:r>
-        <w:rPr>
-          <w:b/>
-          <w:bCs/>
-          <w:color w:val="D86DCB" w:themeColor="accent5" w:themeTint="99"/>
-          <w:sz w:val="36"/>
-          <w:szCs w:val="36"/>
-        </w:rPr>
-        <w:t>BuildContext</w:t>
-      </w:r>
-      <w:proofErr w:type="spellEnd"/>
-      <w:r>
-        <w:rPr>
-          <w:b/>
-          <w:bCs/>
-          <w:color w:val="D86DCB" w:themeColor="accent5" w:themeTint="99"/>
-          <w:sz w:val="36"/>
-          <w:szCs w:val="36"/>
-        </w:rPr>
-        <w:t xml:space="preserve"> context) {</w:t>
-      </w:r>
-    </w:p>
-    <w:p>
-      <w:pPr>
-        <w:jc w:val="both"/>
-        <w:rPr>
-          <w:b/>
-          <w:bCs/>
-          <w:color w:val="D86DCB" w:themeColor="accent5" w:themeTint="99"/>
-          <w:sz w:val="36"/>
-          <w:szCs w:val="36"/>
-        </w:rPr>
-      </w:pPr>
-      <w:r>
-        <w:rPr>
-          <w:b/>
-          <w:bCs/>
-          <w:color w:val="D86DCB" w:themeColor="accent5" w:themeTint="99"/>
-          <w:sz w:val="36"/>
-          <w:szCs w:val="36"/>
-        </w:rPr>
-        <w:t xml:space="preserve">    return </w:t>
-      </w:r>
-      <w:proofErr w:type="spellStart"/>
-      <w:proofErr w:type="gramStart"/>
-      <w:r>
-        <w:rPr>
-          <w:b/>
-          <w:bCs/>
-          <w:color w:val="D86DCB" w:themeColor="accent5" w:themeTint="99"/>
-          <w:sz w:val="36"/>
-          <w:szCs w:val="36"/>
-        </w:rPr>
-        <w:t>SizedBox</w:t>
-      </w:r>
-      <w:proofErr w:type="spellEnd"/>
-      <w:r>
-        <w:rPr>
-          <w:b/>
-          <w:bCs/>
-          <w:color w:val="D86DCB" w:themeColor="accent5" w:themeTint="99"/>
-          <w:sz w:val="36"/>
-          <w:szCs w:val="36"/>
-        </w:rPr>
-        <w:t>(</w:t>
-      </w:r>
-      <w:proofErr w:type="gramEnd"/>
-    </w:p>
-    <w:p>
-      <w:pPr>
-        <w:jc w:val="both"/>
-        <w:rPr>
-          <w:b/>
-          <w:bCs/>
-          <w:color w:val="D86DCB" w:themeColor="accent5" w:themeTint="99"/>
-          <w:sz w:val="36"/>
-          <w:szCs w:val="36"/>
-        </w:rPr>
-      </w:pPr>
-      <w:r>
-        <w:rPr>
-          <w:b/>
-          <w:bCs/>
-          <w:color w:val="D86DCB" w:themeColor="accent5" w:themeTint="99"/>
-          <w:sz w:val="36"/>
-          <w:szCs w:val="36"/>
-        </w:rPr>
-        <w:t xml:space="preserve">      height: 40,</w:t>
-      </w:r>
-    </w:p>
-    <w:p>
-      <w:pPr>
-        <w:jc w:val="both"/>
-        <w:rPr>
-          <w:b/>
-          <w:bCs/>
-          <w:color w:val="D86DCB" w:themeColor="accent5" w:themeTint="99"/>
-          <w:sz w:val="36"/>
-          <w:szCs w:val="36"/>
-        </w:rPr>
-      </w:pPr>
-      <w:r>
-        <w:rPr>
-          <w:b/>
-          <w:bCs/>
-          <w:color w:val="D86DCB" w:themeColor="accent5" w:themeTint="99"/>
-          <w:sz w:val="36"/>
-          <w:szCs w:val="36"/>
-        </w:rPr>
-        <w:lastRenderedPageBreak/>
-        <w:t xml:space="preserve">      child: </w:t>
-      </w:r>
-      <w:proofErr w:type="spellStart"/>
-      <w:r>
-        <w:rPr>
-          <w:b/>
-          <w:bCs/>
-          <w:color w:val="D86DCB" w:themeColor="accent5" w:themeTint="99"/>
-          <w:sz w:val="36"/>
-          <w:szCs w:val="36"/>
-        </w:rPr>
-        <w:t>ListView.builder</w:t>
-      </w:r>
-      <w:proofErr w:type="spellEnd"/>
-      <w:r>
-        <w:rPr>
-          <w:b/>
-          <w:bCs/>
-          <w:color w:val="D86DCB" w:themeColor="accent5" w:themeTint="99"/>
-          <w:sz w:val="36"/>
-          <w:szCs w:val="36"/>
-        </w:rPr>
-        <w:t>(</w:t>
-      </w:r>
-    </w:p>
-    <w:p>
-      <w:pPr>
-        <w:jc w:val="both"/>
-        <w:rPr>
-          <w:b/>
-          <w:bCs/>
-          <w:color w:val="D86DCB" w:themeColor="accent5" w:themeTint="99"/>
-          <w:sz w:val="36"/>
-          <w:szCs w:val="36"/>
-        </w:rPr>
-      </w:pPr>
-      <w:r>
-        <w:rPr>
-          <w:b/>
-          <w:bCs/>
-          <w:color w:val="D86DCB" w:themeColor="accent5" w:themeTint="99"/>
-          <w:sz w:val="36"/>
-          <w:szCs w:val="36"/>
-        </w:rPr>
-        <w:t xml:space="preserve">          </w:t>
-      </w:r>
-      <w:proofErr w:type="spellStart"/>
-      <w:r>
-        <w:rPr>
-          <w:b/>
-          <w:bCs/>
-          <w:color w:val="D86DCB" w:themeColor="accent5" w:themeTint="99"/>
-          <w:sz w:val="36"/>
-          <w:szCs w:val="36"/>
-        </w:rPr>
-        <w:t>scrollDirection</w:t>
-      </w:r>
-      <w:proofErr w:type="spellEnd"/>
-      <w:proofErr w:type="gramStart"/>
-      <w:r>
-        <w:rPr>
-          <w:b/>
-          <w:bCs/>
-          <w:color w:val="D86DCB" w:themeColor="accent5" w:themeTint="99"/>
-          <w:sz w:val="36"/>
-          <w:szCs w:val="36"/>
-        </w:rPr>
-        <w:t>: .horizontal</w:t>
-      </w:r>
-      <w:proofErr w:type="gramEnd"/>
-      <w:r>
-        <w:rPr>
-          <w:b/>
-          <w:bCs/>
-          <w:color w:val="D86DCB" w:themeColor="accent5" w:themeTint="99"/>
-          <w:sz w:val="36"/>
-          <w:szCs w:val="36"/>
-        </w:rPr>
-        <w:t>,</w:t>
-      </w:r>
-    </w:p>
-    <w:p>
-      <w:pPr>
-        <w:jc w:val="both"/>
-        <w:rPr>
-          <w:b/>
-          <w:bCs/>
-          <w:color w:val="D86DCB" w:themeColor="accent5" w:themeTint="99"/>
-          <w:sz w:val="36"/>
-          <w:szCs w:val="36"/>
-        </w:rPr>
-      </w:pPr>
-      <w:r>
-        <w:rPr>
-          <w:b/>
-          <w:bCs/>
-          <w:color w:val="D86DCB" w:themeColor="accent5" w:themeTint="99"/>
-          <w:sz w:val="36"/>
-          <w:szCs w:val="36"/>
-        </w:rPr>
-        <w:t xml:space="preserve">          </w:t>
-      </w:r>
-      <w:proofErr w:type="spellStart"/>
-      <w:r>
-        <w:rPr>
-          <w:b/>
-          <w:bCs/>
-          <w:color w:val="D86DCB" w:themeColor="accent5" w:themeTint="99"/>
-          <w:sz w:val="36"/>
-          <w:szCs w:val="36"/>
-        </w:rPr>
-        <w:t>itemCount</w:t>
-      </w:r>
-      <w:proofErr w:type="spellEnd"/>
-      <w:r>
-        <w:rPr>
-          <w:b/>
-          <w:bCs/>
-          <w:color w:val="D86DCB" w:themeColor="accent5" w:themeTint="99"/>
-          <w:sz w:val="36"/>
-          <w:szCs w:val="36"/>
-        </w:rPr>
-        <w:t xml:space="preserve">: </w:t>
-      </w:r>
-      <w:proofErr w:type="spellStart"/>
-      <w:proofErr w:type="gramStart"/>
-      <w:r>
-        <w:rPr>
-          <w:b/>
-          <w:bCs/>
-          <w:color w:val="D86DCB" w:themeColor="accent5" w:themeTint="99"/>
-          <w:sz w:val="36"/>
-          <w:szCs w:val="36"/>
-        </w:rPr>
-        <w:t>widget.colors</w:t>
-      </w:r>
-      <w:proofErr w:type="gramEnd"/>
-      <w:r>
-        <w:rPr>
-          <w:b/>
-          <w:bCs/>
-          <w:color w:val="D86DCB" w:themeColor="accent5" w:themeTint="99"/>
-          <w:sz w:val="36"/>
-          <w:szCs w:val="36"/>
-        </w:rPr>
-        <w:t>.length</w:t>
-      </w:r>
-      <w:proofErr w:type="spellEnd"/>
-      <w:r>
-        <w:rPr>
-          <w:b/>
-          <w:bCs/>
-          <w:color w:val="D86DCB" w:themeColor="accent5" w:themeTint="99"/>
-          <w:sz w:val="36"/>
-          <w:szCs w:val="36"/>
-        </w:rPr>
-        <w:t>,</w:t>
-      </w:r>
-    </w:p>
-    <w:p>
-      <w:pPr>
-        <w:jc w:val="both"/>
-        <w:rPr>
-          <w:b/>
-          <w:bCs/>
-          <w:color w:val="D86DCB" w:themeColor="accent5" w:themeTint="99"/>
-          <w:sz w:val="36"/>
-          <w:szCs w:val="36"/>
-        </w:rPr>
-      </w:pPr>
-      <w:r>
-        <w:rPr>
-          <w:b/>
-          <w:bCs/>
-          <w:color w:val="D86DCB" w:themeColor="accent5" w:themeTint="99"/>
-          <w:sz w:val="36"/>
-          <w:szCs w:val="36"/>
-        </w:rPr>
-        <w:t xml:space="preserve">          </w:t>
-      </w:r>
-      <w:proofErr w:type="spellStart"/>
-      <w:r>
-        <w:rPr>
-          <w:b/>
-          <w:bCs/>
-          <w:color w:val="D86DCB" w:themeColor="accent5" w:themeTint="99"/>
-          <w:sz w:val="36"/>
-          <w:szCs w:val="36"/>
-        </w:rPr>
-        <w:t>itemBuilder</w:t>
-      </w:r>
-      <w:proofErr w:type="spellEnd"/>
-      <w:r>
-        <w:rPr>
-          <w:b/>
-          <w:bCs/>
-          <w:color w:val="D86DCB" w:themeColor="accent5" w:themeTint="99"/>
-          <w:sz w:val="36"/>
-          <w:szCs w:val="36"/>
-        </w:rPr>
-        <w:t>: (</w:t>
-      </w:r>
-      <w:proofErr w:type="spellStart"/>
-      <w:r>
-        <w:rPr>
-          <w:b/>
-          <w:bCs/>
-          <w:color w:val="D86DCB" w:themeColor="accent5" w:themeTint="99"/>
-          <w:sz w:val="36"/>
-          <w:szCs w:val="36"/>
-        </w:rPr>
-        <w:t>BuildContext</w:t>
-      </w:r>
-      <w:proofErr w:type="spellEnd"/>
-      <w:r>
-        <w:rPr>
-          <w:b/>
-          <w:bCs/>
-          <w:color w:val="D86DCB" w:themeColor="accent5" w:themeTint="99"/>
-          <w:sz w:val="36"/>
-          <w:szCs w:val="36"/>
-        </w:rPr>
-        <w:t xml:space="preserve"> context, int index) {</w:t>
-      </w:r>
-    </w:p>
-    <w:p>
-      <w:pPr>
-        <w:jc w:val="both"/>
-        <w:rPr>
-          <w:b/>
-          <w:bCs/>
-          <w:color w:val="D86DCB" w:themeColor="accent5" w:themeTint="99"/>
-          <w:sz w:val="36"/>
-          <w:szCs w:val="36"/>
-        </w:rPr>
-      </w:pPr>
-      <w:r>
-        <w:rPr>
-          <w:b/>
-          <w:bCs/>
-          <w:color w:val="D86DCB" w:themeColor="accent5" w:themeTint="99"/>
-          <w:sz w:val="36"/>
-          <w:szCs w:val="36"/>
-        </w:rPr>
-        <w:t xml:space="preserve">            final color = </w:t>
-      </w:r>
-      <w:proofErr w:type="spellStart"/>
-      <w:proofErr w:type="gramStart"/>
-      <w:r>
-        <w:rPr>
-          <w:b/>
-          <w:bCs/>
-          <w:color w:val="D86DCB" w:themeColor="accent5" w:themeTint="99"/>
-          <w:sz w:val="36"/>
-          <w:szCs w:val="36"/>
-        </w:rPr>
-        <w:t>widget.colors</w:t>
-      </w:r>
-      <w:proofErr w:type="spellEnd"/>
-      <w:proofErr w:type="gramEnd"/>
-      <w:r>
-        <w:rPr>
-          <w:b/>
-          <w:bCs/>
-          <w:color w:val="D86DCB" w:themeColor="accent5" w:themeTint="99"/>
-          <w:sz w:val="36"/>
-          <w:szCs w:val="36"/>
-        </w:rPr>
-        <w:t>[index];</w:t>
-      </w:r>
-    </w:p>
-    <w:p>
-      <w:pPr>
-        <w:jc w:val="both"/>
-        <w:rPr>
-          <w:b/>
-          <w:bCs/>
-          <w:color w:val="D86DCB" w:themeColor="accent5" w:themeTint="99"/>
-          <w:sz w:val="36"/>
-          <w:szCs w:val="36"/>
-        </w:rPr>
-      </w:pPr>
-      <w:r>
-        <w:rPr>
-          <w:b/>
-          <w:bCs/>
-          <w:color w:val="D86DCB" w:themeColor="accent5" w:themeTint="99"/>
-          <w:sz w:val="36"/>
-          <w:szCs w:val="36"/>
-        </w:rPr>
-        <w:t xml:space="preserve">            final bool </w:t>
-      </w:r>
-      <w:proofErr w:type="spellStart"/>
-      <w:r>
-        <w:rPr>
-          <w:b/>
-          <w:bCs/>
-          <w:color w:val="D86DCB" w:themeColor="accent5" w:themeTint="99"/>
-          <w:sz w:val="36"/>
-          <w:szCs w:val="36"/>
-        </w:rPr>
-        <w:t>isSelected</w:t>
-      </w:r>
-      <w:proofErr w:type="spellEnd"/>
-      <w:r>
-        <w:rPr>
-          <w:b/>
-          <w:bCs/>
-          <w:color w:val="D86DCB" w:themeColor="accent5" w:themeTint="99"/>
-          <w:sz w:val="36"/>
-          <w:szCs w:val="36"/>
-        </w:rPr>
-        <w:t xml:space="preserve"> = </w:t>
-      </w:r>
-      <w:proofErr w:type="spellStart"/>
-      <w:r>
-        <w:rPr>
-          <w:b/>
-          <w:bCs/>
-          <w:color w:val="D86DCB" w:themeColor="accent5" w:themeTint="99"/>
-          <w:sz w:val="36"/>
-          <w:szCs w:val="36"/>
-        </w:rPr>
-        <w:t>selectedValue</w:t>
-      </w:r>
-      <w:proofErr w:type="spellEnd"/>
-      <w:r>
-        <w:rPr>
-          <w:b/>
-          <w:bCs/>
-          <w:color w:val="D86DCB" w:themeColor="accent5" w:themeTint="99"/>
-          <w:sz w:val="36"/>
-          <w:szCs w:val="36"/>
-        </w:rPr>
-        <w:t xml:space="preserve"> == color;</w:t>
-      </w:r>
-    </w:p>
-    <w:p>
-      <w:pPr>
-        <w:jc w:val="both"/>
-        <w:rPr>
-          <w:b/>
-          <w:bCs/>
-          <w:color w:val="D86DCB" w:themeColor="accent5" w:themeTint="99"/>
-          <w:sz w:val="36"/>
-          <w:szCs w:val="36"/>
-        </w:rPr>
-      </w:pPr>
-      <w:r>
-        <w:rPr>
-          <w:b/>
-          <w:bCs/>
-          <w:color w:val="D86DCB" w:themeColor="accent5" w:themeTint="99"/>
-          <w:sz w:val="36"/>
-          <w:szCs w:val="36"/>
-        </w:rPr>
-        <w:t xml:space="preserve">            return </w:t>
-      </w:r>
-      <w:proofErr w:type="spellStart"/>
-      <w:proofErr w:type="gramStart"/>
-      <w:r>
-        <w:rPr>
-          <w:b/>
-          <w:bCs/>
-          <w:color w:val="D86DCB" w:themeColor="accent5" w:themeTint="99"/>
-          <w:sz w:val="36"/>
-          <w:szCs w:val="36"/>
-        </w:rPr>
-        <w:t>GestureDetector</w:t>
-      </w:r>
-      <w:proofErr w:type="spellEnd"/>
-      <w:r>
-        <w:rPr>
-          <w:b/>
-          <w:bCs/>
-          <w:color w:val="D86DCB" w:themeColor="accent5" w:themeTint="99"/>
-          <w:sz w:val="36"/>
-          <w:szCs w:val="36"/>
-        </w:rPr>
-        <w:t>(</w:t>
-      </w:r>
-      <w:proofErr w:type="gramEnd"/>
-    </w:p>
-    <w:p>
-      <w:pPr>
-        <w:jc w:val="both"/>
-        <w:rPr>
-          <w:b/>
-          <w:bCs/>
-          <w:color w:val="D86DCB" w:themeColor="accent5" w:themeTint="99"/>
-          <w:sz w:val="36"/>
-          <w:szCs w:val="36"/>
-        </w:rPr>
-      </w:pPr>
-      <w:r>
-        <w:rPr>
-          <w:b/>
-          <w:bCs/>
-          <w:color w:val="D86DCB" w:themeColor="accent5" w:themeTint="99"/>
-          <w:sz w:val="36"/>
-          <w:szCs w:val="36"/>
-        </w:rPr>
-        <w:t xml:space="preserve">              </w:t>
-      </w:r>
-      <w:proofErr w:type="spellStart"/>
-      <w:r>
-        <w:rPr>
-          <w:b/>
-          <w:bCs/>
-          <w:color w:val="D86DCB" w:themeColor="accent5" w:themeTint="99"/>
-          <w:sz w:val="36"/>
-          <w:szCs w:val="36"/>
-        </w:rPr>
-        <w:t>onTap</w:t>
-      </w:r>
-      <w:proofErr w:type="spellEnd"/>
-      <w:r>
-        <w:rPr>
-          <w:b/>
-          <w:bCs/>
-          <w:color w:val="D86DCB" w:themeColor="accent5" w:themeTint="99"/>
-          <w:sz w:val="36"/>
-          <w:szCs w:val="36"/>
-        </w:rPr>
-        <w:t>: () {</w:t>
-      </w:r>
-    </w:p>
-    <w:p>
-      <w:pPr>
-        <w:jc w:val="both"/>
-        <w:rPr>
-          <w:b/>
-          <w:bCs/>
-          <w:color w:val="D86DCB" w:themeColor="accent5" w:themeTint="99"/>
-          <w:sz w:val="36"/>
-          <w:szCs w:val="36"/>
-        </w:rPr>
-      </w:pPr>
-      <w:r>
-        <w:rPr>
-          <w:b/>
-          <w:bCs/>
-          <w:color w:val="D86DCB" w:themeColor="accent5" w:themeTint="99"/>
-          <w:sz w:val="36"/>
-          <w:szCs w:val="36"/>
-        </w:rPr>
-        <w:t xml:space="preserve">                </w:t>
-      </w:r>
-      <w:proofErr w:type="spellStart"/>
-      <w:proofErr w:type="gramStart"/>
-      <w:r>
-        <w:rPr>
-          <w:b/>
-          <w:bCs/>
-          <w:color w:val="D86DCB" w:themeColor="accent5" w:themeTint="99"/>
-          <w:sz w:val="36"/>
-          <w:szCs w:val="36"/>
-        </w:rPr>
-        <w:t>setState</w:t>
-      </w:r>
-      <w:proofErr w:type="spellEnd"/>
-      <w:r>
-        <w:rPr>
-          <w:b/>
-          <w:bCs/>
-          <w:color w:val="D86DCB" w:themeColor="accent5" w:themeTint="99"/>
-          <w:sz w:val="36"/>
-          <w:szCs w:val="36"/>
-        </w:rPr>
-        <w:t>(</w:t>
-      </w:r>
-      <w:proofErr w:type="gramEnd"/>
-      <w:r>
-        <w:rPr>
-          <w:b/>
-          <w:bCs/>
-          <w:color w:val="D86DCB" w:themeColor="accent5" w:themeTint="99"/>
-          <w:sz w:val="36"/>
-          <w:szCs w:val="36"/>
-        </w:rPr>
-        <w:t>() {</w:t>
-      </w:r>
-    </w:p>
-    <w:p>
-      <w:pPr>
-        <w:jc w:val="both"/>
-        <w:rPr>
-          <w:b/>
-          <w:bCs/>
-          <w:color w:val="D86DCB" w:themeColor="accent5" w:themeTint="99"/>
-          <w:sz w:val="36"/>
-          <w:szCs w:val="36"/>
-        </w:rPr>
-      </w:pPr>
-      <w:r>
-        <w:rPr>
-          <w:b/>
-          <w:bCs/>
-          <w:color w:val="D86DCB" w:themeColor="accent5" w:themeTint="99"/>
-          <w:sz w:val="36"/>
-          <w:szCs w:val="36"/>
-        </w:rPr>
-        <w:t xml:space="preserve">                  </w:t>
-      </w:r>
-      <w:proofErr w:type="spellStart"/>
-      <w:r>
-        <w:rPr>
-          <w:b/>
-          <w:bCs/>
-          <w:color w:val="D86DCB" w:themeColor="accent5" w:themeTint="99"/>
-          <w:sz w:val="36"/>
-          <w:szCs w:val="36"/>
-        </w:rPr>
-        <w:t>selectedValue</w:t>
-      </w:r>
-      <w:proofErr w:type="spellEnd"/>
-      <w:r>
-        <w:rPr>
-          <w:b/>
-          <w:bCs/>
-          <w:color w:val="D86DCB" w:themeColor="accent5" w:themeTint="99"/>
-          <w:sz w:val="36"/>
-          <w:szCs w:val="36"/>
-        </w:rPr>
-        <w:t xml:space="preserve"> = color;</w:t>
-      </w:r>
-    </w:p>
-    <w:p>
-      <w:pPr>
-        <w:jc w:val="both"/>
-        <w:rPr>
-          <w:b/>
-          <w:bCs/>
-          <w:color w:val="D86DCB" w:themeColor="accent5" w:themeTint="99"/>
-          <w:sz w:val="36"/>
-          <w:szCs w:val="36"/>
-        </w:rPr>
-      </w:pPr>
-      <w:r>
-        <w:rPr>
-          <w:b/>
-          <w:bCs/>
-          <w:color w:val="D86DCB" w:themeColor="accent5" w:themeTint="99"/>
-          <w:sz w:val="36"/>
-          <w:szCs w:val="36"/>
-        </w:rPr>
-        <w:t xml:space="preserve">                  </w:t>
-      </w:r>
-      <w:proofErr w:type="spellStart"/>
-      <w:proofErr w:type="gramStart"/>
-      <w:r>
-        <w:rPr>
-          <w:b/>
-          <w:bCs/>
-          <w:color w:val="D86DCB" w:themeColor="accent5" w:themeTint="99"/>
-          <w:sz w:val="36"/>
-          <w:szCs w:val="36"/>
-        </w:rPr>
-        <w:t>widget.onChanged</w:t>
-      </w:r>
-      <w:proofErr w:type="spellEnd"/>
-      <w:proofErr w:type="gramEnd"/>
-      <w:r>
-        <w:rPr>
-          <w:b/>
-          <w:bCs/>
-          <w:color w:val="D86DCB" w:themeColor="accent5" w:themeTint="99"/>
-          <w:sz w:val="36"/>
-          <w:szCs w:val="36"/>
-        </w:rPr>
-        <w:t>(color);</w:t>
-      </w:r>
-    </w:p>
-    <w:p>
-      <w:pPr>
-        <w:jc w:val="both"/>
-        <w:rPr>
-          <w:b/>
-          <w:bCs/>
-          <w:color w:val="D86DCB" w:themeColor="accent5" w:themeTint="99"/>
-          <w:sz w:val="36"/>
-          <w:szCs w:val="36"/>
-        </w:rPr>
-      </w:pPr>
-      <w:r>
-        <w:rPr>
-          <w:b/>
-          <w:bCs/>
-          <w:color w:val="D86DCB" w:themeColor="accent5" w:themeTint="99"/>
-          <w:sz w:val="36"/>
-          <w:szCs w:val="36"/>
-        </w:rPr>
-        <w:t xml:space="preserve">                });</w:t>
-      </w:r>
-    </w:p>
-    <w:p>
-      <w:pPr>
-        <w:jc w:val="both"/>
-        <w:rPr>
-          <w:b/>
-          <w:bCs/>
-          <w:color w:val="D86DCB" w:themeColor="accent5" w:themeTint="99"/>
-          <w:sz w:val="36"/>
-          <w:szCs w:val="36"/>
-        </w:rPr>
-      </w:pPr>
-      <w:r>
-        <w:rPr>
-          <w:b/>
-          <w:bCs/>
-          <w:color w:val="D86DCB" w:themeColor="accent5" w:themeTint="99"/>
-          <w:sz w:val="36"/>
-          <w:szCs w:val="36"/>
-        </w:rPr>
-        <w:t xml:space="preserve">              },</w:t>
-      </w:r>
-    </w:p>
-    <w:p>
-      <w:pPr>
-        <w:jc w:val="both"/>
-        <w:rPr>
-          <w:b/>
-          <w:bCs/>
-          <w:color w:val="D86DCB" w:themeColor="accent5" w:themeTint="99"/>
-          <w:sz w:val="36"/>
-          <w:szCs w:val="36"/>
-        </w:rPr>
-      </w:pPr>
-      <w:r>
-        <w:rPr>
-          <w:b/>
-          <w:bCs/>
-          <w:color w:val="D86DCB" w:themeColor="accent5" w:themeTint="99"/>
-          <w:sz w:val="36"/>
-          <w:szCs w:val="36"/>
-        </w:rPr>
-        <w:t xml:space="preserve">              child: </w:t>
-      </w:r>
-      <w:proofErr w:type="gramStart"/>
-      <w:r>
-        <w:rPr>
-          <w:b/>
-          <w:bCs/>
-          <w:color w:val="D86DCB" w:themeColor="accent5" w:themeTint="99"/>
-          <w:sz w:val="36"/>
-          <w:szCs w:val="36"/>
-        </w:rPr>
-        <w:t>Container(</w:t>
-      </w:r>
-      <w:proofErr w:type="gramEnd"/>
-    </w:p>
-    <w:p>
-      <w:pPr>
-        <w:jc w:val="both"/>
-        <w:rPr>
-          <w:b/>
-          <w:bCs/>
-          <w:color w:val="D86DCB" w:themeColor="accent5" w:themeTint="99"/>
-          <w:sz w:val="36"/>
-          <w:szCs w:val="36"/>
-        </w:rPr>
-      </w:pPr>
-      <w:r>
-        <w:rPr>
-          <w:b/>
-          <w:bCs/>
-          <w:color w:val="D86DCB" w:themeColor="accent5" w:themeTint="99"/>
-          <w:sz w:val="36"/>
-          <w:szCs w:val="36"/>
-        </w:rPr>
-        <w:t xml:space="preserve">                padding: const </w:t>
-      </w:r>
-      <w:proofErr w:type="spellStart"/>
-      <w:r>
-        <w:rPr>
-          <w:b/>
-          <w:bCs/>
-          <w:color w:val="D86DCB" w:themeColor="accent5" w:themeTint="99"/>
-          <w:sz w:val="36"/>
-          <w:szCs w:val="36"/>
-        </w:rPr>
-        <w:t>EdgeInsets.symmetric</w:t>
-      </w:r>
-      <w:proofErr w:type="spellEnd"/>
-      <w:r>
-        <w:rPr>
-          <w:b/>
-          <w:bCs/>
-          <w:color w:val="D86DCB" w:themeColor="accent5" w:themeTint="99"/>
-          <w:sz w:val="36"/>
-          <w:szCs w:val="36"/>
-        </w:rPr>
-        <w:t>(vertical: 8, horizontal: 16),</w:t>
-      </w:r>
-    </w:p>
-    <w:p>
-      <w:pPr>
-        <w:jc w:val="both"/>
-        <w:rPr>
-          <w:b/>
-          <w:bCs/>
-          <w:color w:val="D86DCB" w:themeColor="accent5" w:themeTint="99"/>
-          <w:sz w:val="36"/>
-          <w:szCs w:val="36"/>
-        </w:rPr>
-      </w:pPr>
-      <w:r>
-        <w:rPr>
-          <w:b/>
-          <w:bCs/>
-          <w:color w:val="D86DCB" w:themeColor="accent5" w:themeTint="99"/>
-          <w:sz w:val="36"/>
-          <w:szCs w:val="36"/>
-        </w:rPr>
-        <w:t xml:space="preserve">                margin: const </w:t>
-      </w:r>
-      <w:proofErr w:type="spellStart"/>
-      <w:r>
-        <w:rPr>
-          <w:b/>
-          <w:bCs/>
-          <w:color w:val="D86DCB" w:themeColor="accent5" w:themeTint="99"/>
-          <w:sz w:val="36"/>
-          <w:szCs w:val="36"/>
-        </w:rPr>
-        <w:t>EdgeInsets.symmetric</w:t>
-      </w:r>
-      <w:proofErr w:type="spellEnd"/>
-      <w:r>
-        <w:rPr>
-          <w:b/>
-          <w:bCs/>
-          <w:color w:val="D86DCB" w:themeColor="accent5" w:themeTint="99"/>
-          <w:sz w:val="36"/>
-          <w:szCs w:val="36"/>
-        </w:rPr>
-        <w:t>(horizontal: 8),</w:t>
-      </w:r>
-    </w:p>
-    <w:p>
-      <w:pPr>
-        <w:jc w:val="both"/>
-        <w:rPr>
-          <w:b/>
-          <w:bCs/>
-          <w:color w:val="D86DCB" w:themeColor="accent5" w:themeTint="99"/>
-          <w:sz w:val="36"/>
-          <w:szCs w:val="36"/>
-        </w:rPr>
-      </w:pPr>
-      <w:r>
-        <w:rPr>
-          <w:b/>
-          <w:bCs/>
-          <w:color w:val="D86DCB" w:themeColor="accent5" w:themeTint="99"/>
-          <w:sz w:val="36"/>
-          <w:szCs w:val="36"/>
-        </w:rPr>
-        <w:t xml:space="preserve">                decoration: </w:t>
-      </w:r>
-      <w:proofErr w:type="spellStart"/>
-      <w:proofErr w:type="gramStart"/>
-      <w:r>
-        <w:rPr>
-          <w:b/>
-          <w:bCs/>
-          <w:color w:val="D86DCB" w:themeColor="accent5" w:themeTint="99"/>
-          <w:sz w:val="36"/>
-          <w:szCs w:val="36"/>
-        </w:rPr>
-        <w:t>BoxDecoration</w:t>
-      </w:r>
-      <w:proofErr w:type="spellEnd"/>
-      <w:r>
-        <w:rPr>
-          <w:b/>
-          <w:bCs/>
-          <w:color w:val="D86DCB" w:themeColor="accent5" w:themeTint="99"/>
-          <w:sz w:val="36"/>
-          <w:szCs w:val="36"/>
-        </w:rPr>
-        <w:t>(</w:t>
-      </w:r>
-      <w:proofErr w:type="gramEnd"/>
-    </w:p>
-    <w:p>
-      <w:pPr>
-        <w:jc w:val="both"/>
-        <w:rPr>
-          <w:b/>
-          <w:bCs/>
-          <w:color w:val="D86DCB" w:themeColor="accent5" w:themeTint="99"/>
-          <w:sz w:val="36"/>
-          <w:szCs w:val="36"/>
-        </w:rPr>
-      </w:pPr>
-      <w:r>
-        <w:rPr>
-          <w:b/>
-          <w:bCs/>
-          <w:color w:val="D86DCB" w:themeColor="accent5" w:themeTint="99"/>
-          <w:sz w:val="36"/>
-          <w:szCs w:val="36"/>
-        </w:rPr>
-        <w:t xml:space="preserve">                  color: </w:t>
-      </w:r>
-      <w:proofErr w:type="spellStart"/>
-      <w:proofErr w:type="gramStart"/>
-      <w:r>
-        <w:rPr>
-          <w:b/>
-          <w:bCs/>
-          <w:color w:val="D86DCB" w:themeColor="accent5" w:themeTint="99"/>
-          <w:sz w:val="36"/>
-          <w:szCs w:val="36"/>
-        </w:rPr>
-        <w:t>isSelected</w:t>
-      </w:r>
-      <w:proofErr w:type="spellEnd"/>
-      <w:r>
-        <w:rPr>
-          <w:b/>
-          <w:bCs/>
-          <w:color w:val="D86DCB" w:themeColor="accent5" w:themeTint="99"/>
-          <w:sz w:val="36"/>
-          <w:szCs w:val="36"/>
-        </w:rPr>
-        <w:t xml:space="preserve"> ?</w:t>
-      </w:r>
-      <w:proofErr w:type="gramEnd"/>
-      <w:r>
-        <w:rPr>
-          <w:b/>
-          <w:bCs/>
-          <w:color w:val="D86DCB" w:themeColor="accent5" w:themeTint="99"/>
-          <w:sz w:val="36"/>
-          <w:szCs w:val="36"/>
-        </w:rPr>
-        <w:t xml:space="preserve"> </w:t>
-      </w:r>
-      <w:proofErr w:type="spellStart"/>
-      <w:proofErr w:type="gramStart"/>
-      <w:r>
-        <w:rPr>
-          <w:b/>
-          <w:bCs/>
-          <w:color w:val="D86DCB" w:themeColor="accent5" w:themeTint="99"/>
-          <w:sz w:val="36"/>
-          <w:szCs w:val="36"/>
-        </w:rPr>
-        <w:t>Colors.lightGreen</w:t>
-      </w:r>
-      <w:proofErr w:type="spellEnd"/>
-      <w:r>
-        <w:rPr>
-          <w:b/>
-          <w:bCs/>
-          <w:color w:val="D86DCB" w:themeColor="accent5" w:themeTint="99"/>
-          <w:sz w:val="36"/>
-          <w:szCs w:val="36"/>
-        </w:rPr>
-        <w:t xml:space="preserve"> :</w:t>
-      </w:r>
-      <w:proofErr w:type="gramEnd"/>
-      <w:r>
-        <w:rPr>
-          <w:b/>
-          <w:bCs/>
-          <w:color w:val="D86DCB" w:themeColor="accent5" w:themeTint="99"/>
-          <w:sz w:val="36"/>
-          <w:szCs w:val="36"/>
-        </w:rPr>
-        <w:t xml:space="preserve"> </w:t>
-      </w:r>
-      <w:proofErr w:type="spellStart"/>
-      <w:r>
-        <w:rPr>
-          <w:b/>
-          <w:bCs/>
-          <w:color w:val="D86DCB" w:themeColor="accent5" w:themeTint="99"/>
-          <w:sz w:val="36"/>
-          <w:szCs w:val="36"/>
-        </w:rPr>
-        <w:t>Colors.transparent</w:t>
-      </w:r>
-      <w:proofErr w:type="spellEnd"/>
-      <w:r>
-        <w:rPr>
-          <w:b/>
-          <w:bCs/>
-          <w:color w:val="D86DCB" w:themeColor="accent5" w:themeTint="99"/>
-          <w:sz w:val="36"/>
-          <w:szCs w:val="36"/>
-        </w:rPr>
-        <w:t>,</w:t>
-      </w:r>
-    </w:p>
-    <w:p>
-      <w:pPr>
-        <w:jc w:val="both"/>
-        <w:rPr>
-          <w:b/>
-          <w:bCs/>
-          <w:color w:val="D86DCB" w:themeColor="accent5" w:themeTint="99"/>
-          <w:sz w:val="36"/>
-          <w:szCs w:val="36"/>
-        </w:rPr>
-      </w:pPr>
-      <w:r>
-        <w:rPr>
-          <w:b/>
-          <w:bCs/>
-          <w:color w:val="D86DCB" w:themeColor="accent5" w:themeTint="99"/>
-          <w:sz w:val="36"/>
-          <w:szCs w:val="36"/>
-        </w:rPr>
-        <w:lastRenderedPageBreak/>
-        <w:t xml:space="preserve">                  </w:t>
-      </w:r>
-      <w:proofErr w:type="spellStart"/>
-      <w:r>
-        <w:rPr>
-          <w:b/>
-          <w:bCs/>
-          <w:color w:val="D86DCB" w:themeColor="accent5" w:themeTint="99"/>
-          <w:sz w:val="36"/>
-          <w:szCs w:val="36"/>
-        </w:rPr>
-        <w:t>borderRadius</w:t>
-      </w:r>
-      <w:proofErr w:type="spellEnd"/>
-      <w:r>
-        <w:rPr>
-          <w:b/>
-          <w:bCs/>
-          <w:color w:val="D86DCB" w:themeColor="accent5" w:themeTint="99"/>
-          <w:sz w:val="36"/>
-          <w:szCs w:val="36"/>
-        </w:rPr>
-        <w:t xml:space="preserve">: </w:t>
-      </w:r>
-      <w:proofErr w:type="spellStart"/>
-      <w:r>
-        <w:rPr>
-          <w:b/>
-          <w:bCs/>
-          <w:color w:val="D86DCB" w:themeColor="accent5" w:themeTint="99"/>
-          <w:sz w:val="36"/>
-          <w:szCs w:val="36"/>
-        </w:rPr>
-        <w:t>BorderRadius.circular</w:t>
-      </w:r>
-      <w:proofErr w:type="spellEnd"/>
-      <w:r>
-        <w:rPr>
-          <w:b/>
-          <w:bCs/>
-          <w:color w:val="D86DCB" w:themeColor="accent5" w:themeTint="99"/>
-          <w:sz w:val="36"/>
-          <w:szCs w:val="36"/>
-        </w:rPr>
-        <w:t>(6),</w:t>
-      </w:r>
-    </w:p>
-    <w:p>
-      <w:pPr>
-        <w:jc w:val="both"/>
-        <w:rPr>
-          <w:b/>
-          <w:bCs/>
-          <w:color w:val="D86DCB" w:themeColor="accent5" w:themeTint="99"/>
-          <w:sz w:val="36"/>
-          <w:szCs w:val="36"/>
-        </w:rPr>
-      </w:pPr>
-      <w:r>
-        <w:rPr>
-          <w:b/>
-          <w:bCs/>
-          <w:color w:val="D86DCB" w:themeColor="accent5" w:themeTint="99"/>
-          <w:sz w:val="36"/>
-          <w:szCs w:val="36"/>
-        </w:rPr>
-        <w:t xml:space="preserve">                  border: </w:t>
-      </w:r>
-      <w:proofErr w:type="spellStart"/>
-      <w:proofErr w:type="gramStart"/>
-      <w:r>
-        <w:rPr>
-          <w:b/>
-          <w:bCs/>
-          <w:color w:val="D86DCB" w:themeColor="accent5" w:themeTint="99"/>
-          <w:sz w:val="36"/>
-          <w:szCs w:val="36"/>
-        </w:rPr>
-        <w:t>Border.all</w:t>
-      </w:r>
-      <w:proofErr w:type="spellEnd"/>
-      <w:r>
-        <w:rPr>
-          <w:b/>
-          <w:bCs/>
-          <w:color w:val="D86DCB" w:themeColor="accent5" w:themeTint="99"/>
-          <w:sz w:val="36"/>
-          <w:szCs w:val="36"/>
-        </w:rPr>
-        <w:t>(</w:t>
-      </w:r>
-      <w:proofErr w:type="gramEnd"/>
-      <w:r>
-        <w:rPr>
-          <w:b/>
-          <w:bCs/>
-          <w:color w:val="D86DCB" w:themeColor="accent5" w:themeTint="99"/>
-          <w:sz w:val="36"/>
-          <w:szCs w:val="36"/>
-        </w:rPr>
-        <w:t>color: Colors.grey),</w:t>
-      </w:r>
-    </w:p>
-    <w:p>
-      <w:pPr>
-        <w:jc w:val="both"/>
-        <w:rPr>
-          <w:b/>
-          <w:bCs/>
-          <w:color w:val="D86DCB" w:themeColor="accent5" w:themeTint="99"/>
-          <w:sz w:val="36"/>
-          <w:szCs w:val="36"/>
-        </w:rPr>
-      </w:pPr>
-      <w:r>
-        <w:rPr>
-          <w:b/>
-          <w:bCs/>
-          <w:color w:val="D86DCB" w:themeColor="accent5" w:themeTint="99"/>
-          <w:sz w:val="36"/>
-          <w:szCs w:val="36"/>
-        </w:rPr>
-        <w:t xml:space="preserve">                ),</w:t>
-      </w:r>
-    </w:p>
-    <w:p>
-      <w:pPr>
-        <w:jc w:val="both"/>
-        <w:rPr>
-          <w:b/>
-          <w:bCs/>
-          <w:color w:val="D86DCB" w:themeColor="accent5" w:themeTint="99"/>
-          <w:sz w:val="36"/>
-          <w:szCs w:val="36"/>
-        </w:rPr>
-      </w:pPr>
-      <w:r>
-        <w:rPr>
-          <w:b/>
-          <w:bCs/>
-          <w:color w:val="D86DCB" w:themeColor="accent5" w:themeTint="99"/>
-          <w:sz w:val="36"/>
-          <w:szCs w:val="36"/>
-        </w:rPr>
-        <w:t xml:space="preserve">                child: Text(</w:t>
-      </w:r>
-      <w:proofErr w:type="spellStart"/>
-      <w:proofErr w:type="gramStart"/>
-      <w:r>
-        <w:rPr>
-          <w:b/>
-          <w:bCs/>
-          <w:color w:val="D86DCB" w:themeColor="accent5" w:themeTint="99"/>
-          <w:sz w:val="36"/>
-          <w:szCs w:val="36"/>
-        </w:rPr>
-        <w:t>widget.colors</w:t>
-      </w:r>
-      <w:proofErr w:type="spellEnd"/>
-      <w:proofErr w:type="gramEnd"/>
-      <w:r>
-        <w:rPr>
-          <w:b/>
-          <w:bCs/>
-          <w:color w:val="D86DCB" w:themeColor="accent5" w:themeTint="99"/>
-          <w:sz w:val="36"/>
-          <w:szCs w:val="36"/>
-        </w:rPr>
-        <w:t xml:space="preserve">[index], style: </w:t>
-      </w:r>
-      <w:proofErr w:type="spellStart"/>
-      <w:r>
-        <w:rPr>
-          <w:b/>
-          <w:bCs/>
-          <w:color w:val="D86DCB" w:themeColor="accent5" w:themeTint="99"/>
-          <w:sz w:val="36"/>
-          <w:szCs w:val="36"/>
-        </w:rPr>
-        <w:t>TextStyle</w:t>
-      </w:r>
-      <w:proofErr w:type="spellEnd"/>
-      <w:r>
-        <w:rPr>
-          <w:b/>
-          <w:bCs/>
-          <w:color w:val="D86DCB" w:themeColor="accent5" w:themeTint="99"/>
-          <w:sz w:val="36"/>
-          <w:szCs w:val="36"/>
-        </w:rPr>
-        <w:t xml:space="preserve">(color: </w:t>
-      </w:r>
-      <w:proofErr w:type="spellStart"/>
-      <w:r>
-        <w:rPr>
-          <w:b/>
-          <w:bCs/>
-          <w:color w:val="D86DCB" w:themeColor="accent5" w:themeTint="99"/>
-          <w:sz w:val="36"/>
-          <w:szCs w:val="36"/>
-        </w:rPr>
-        <w:t>isSelected</w:t>
-      </w:r>
-      <w:proofErr w:type="spellEnd"/>
-      <w:r>
-        <w:rPr>
-          <w:b/>
-          <w:bCs/>
-          <w:color w:val="D86DCB" w:themeColor="accent5" w:themeTint="99"/>
-          <w:sz w:val="36"/>
-          <w:szCs w:val="36"/>
-        </w:rPr>
-        <w:t xml:space="preserve"> ? </w:t>
-      </w:r>
-      <w:proofErr w:type="spellStart"/>
-      <w:proofErr w:type="gramStart"/>
-      <w:r>
-        <w:rPr>
-          <w:b/>
-          <w:bCs/>
-          <w:color w:val="D86DCB" w:themeColor="accent5" w:themeTint="99"/>
-          <w:sz w:val="36"/>
-          <w:szCs w:val="36"/>
-        </w:rPr>
-        <w:t>Colors.white</w:t>
-      </w:r>
-      <w:proofErr w:type="spellEnd"/>
-      <w:r>
-        <w:rPr>
-          <w:b/>
-          <w:bCs/>
-          <w:color w:val="D86DCB" w:themeColor="accent5" w:themeTint="99"/>
-          <w:sz w:val="36"/>
-          <w:szCs w:val="36"/>
-        </w:rPr>
-        <w:t xml:space="preserve"> :</w:t>
-      </w:r>
-      <w:proofErr w:type="gramEnd"/>
-      <w:r>
-        <w:rPr>
-          <w:b/>
-          <w:bCs/>
-          <w:color w:val="D86DCB" w:themeColor="accent5" w:themeTint="99"/>
-          <w:sz w:val="36"/>
-          <w:szCs w:val="36"/>
-        </w:rPr>
-        <w:t xml:space="preserve"> </w:t>
-      </w:r>
-      <w:proofErr w:type="spellStart"/>
-      <w:r>
-        <w:rPr>
-          <w:b/>
-          <w:bCs/>
-          <w:color w:val="D86DCB" w:themeColor="accent5" w:themeTint="99"/>
-          <w:sz w:val="36"/>
-          <w:szCs w:val="36"/>
-        </w:rPr>
-        <w:t>Colors.black</w:t>
-      </w:r>
-      <w:proofErr w:type="spellEnd"/>
-      <w:r>
-        <w:rPr>
-          <w:b/>
-          <w:bCs/>
-          <w:color w:val="D86DCB" w:themeColor="accent5" w:themeTint="99"/>
-          <w:sz w:val="36"/>
-          <w:szCs w:val="36"/>
-        </w:rPr>
-        <w:t>)),</w:t>
-      </w:r>
-    </w:p>
-    <w:p>
-      <w:pPr>
-        <w:jc w:val="both"/>
-        <w:rPr>
-          <w:b/>
-          <w:bCs/>
-          <w:color w:val="D86DCB" w:themeColor="accent5" w:themeTint="99"/>
-          <w:sz w:val="36"/>
-          <w:szCs w:val="36"/>
-        </w:rPr>
-      </w:pPr>
-      <w:r>
-        <w:rPr>
-          <w:b/>
-          <w:bCs/>
-          <w:color w:val="D86DCB" w:themeColor="accent5" w:themeTint="99"/>
-          <w:sz w:val="36"/>
-          <w:szCs w:val="36"/>
-        </w:rPr>
-        <w:t xml:space="preserve">              …</w:t>
-      </w:r>
-    </w:p>
-    <w:p>
-      <w:pPr>
-        <w:jc w:val="both"/>
-        <w:rPr>
-          <w:b/>
-          <w:bCs/>
-          <w:color w:val="D86DCB" w:themeColor="accent5" w:themeTint="99"/>
-          <w:sz w:val="36"/>
-          <w:szCs w:val="36"/>
-        </w:rPr>
-      </w:pPr>
-      <w:r>
-        <w:rPr>
-          <w:b/>
-          <w:bCs/>
-          <w:color w:val="D86DCB" w:themeColor="accent5" w:themeTint="99"/>
-          <w:sz w:val="36"/>
-          <w:szCs w:val="36"/>
-        </w:rPr>
-        <w:t>}</w:t>
-      </w:r>
-    </w:p>
-    <w:p>
-      <w:pPr>
-        <w:jc w:val="both"/>
-        <w:rPr>
-          <w:sz w:val="36"/>
-          <w:szCs w:val="36"/>
-        </w:rPr>
-      </w:pPr>
-      <w:r>
-        <w:rPr>
-          <w:b/>
-          <w:bCs/>
-          <w:sz w:val="36"/>
-          <w:szCs w:val="36"/>
-        </w:rPr>
-        <w:t>NOTE:</w:t>
-      </w:r>
-      <w:r>
-        <w:rPr>
-          <w:sz w:val="36"/>
-          <w:szCs w:val="36"/>
-        </w:rPr>
-        <w:t xml:space="preserve"> We can use </w:t>
-      </w:r>
-      <w:proofErr w:type="spellStart"/>
-      <w:r>
-        <w:rPr>
-          <w:b/>
-          <w:bCs/>
-          <w:sz w:val="36"/>
-          <w:szCs w:val="36"/>
-        </w:rPr>
-        <w:t>List.generate</w:t>
-      </w:r>
-      <w:proofErr w:type="spellEnd"/>
-      <w:r>
-        <w:rPr>
-          <w:b/>
-          <w:bCs/>
-          <w:sz w:val="36"/>
-          <w:szCs w:val="36"/>
-        </w:rPr>
-        <w:t>(…)</w:t>
-      </w:r>
-      <w:r>
-        <w:rPr>
-          <w:sz w:val="36"/>
-          <w:szCs w:val="36"/>
-        </w:rPr>
-        <w:t xml:space="preserve"> instead of </w:t>
-      </w:r>
-      <w:proofErr w:type="spellStart"/>
-      <w:r>
-        <w:rPr>
-          <w:b/>
-          <w:bCs/>
-          <w:sz w:val="36"/>
-          <w:szCs w:val="36"/>
-        </w:rPr>
-        <w:t>ListView.builder</w:t>
-      </w:r>
-      <w:proofErr w:type="spellEnd"/>
-      <w:r>
-        <w:rPr>
-          <w:sz w:val="36"/>
-          <w:szCs w:val="36"/>
-        </w:rPr>
-        <w:t xml:space="preserve"> if we have a really short list of items (Because we don’t need to scroll). We can also use </w:t>
-      </w:r>
-      <w:proofErr w:type="spellStart"/>
-      <w:r>
-        <w:rPr>
-          <w:b/>
-          <w:bCs/>
-          <w:sz w:val="36"/>
-          <w:szCs w:val="36"/>
-        </w:rPr>
-        <w:t>ValueNotifier</w:t>
-      </w:r>
-      <w:proofErr w:type="spellEnd"/>
-      <w:r>
-        <w:rPr>
-          <w:b/>
-          <w:bCs/>
-          <w:sz w:val="36"/>
-          <w:szCs w:val="36"/>
-        </w:rPr>
-        <w:t>&lt;T&gt;</w:t>
-      </w:r>
-      <w:r>
-        <w:rPr>
-          <w:sz w:val="36"/>
-          <w:szCs w:val="36"/>
-        </w:rPr>
-        <w:t xml:space="preserve"> instead of </w:t>
-      </w:r>
-      <w:proofErr w:type="spellStart"/>
-      <w:proofErr w:type="gramStart"/>
-      <w:r>
-        <w:rPr>
-          <w:b/>
-          <w:bCs/>
-          <w:sz w:val="36"/>
-          <w:szCs w:val="36"/>
-        </w:rPr>
-        <w:t>setState</w:t>
-      </w:r>
-      <w:proofErr w:type="spellEnd"/>
-      <w:r>
-        <w:rPr>
-          <w:b/>
-          <w:bCs/>
-          <w:sz w:val="36"/>
-          <w:szCs w:val="36"/>
-        </w:rPr>
-        <w:t>(</w:t>
-      </w:r>
-      <w:proofErr w:type="gramEnd"/>
-      <w:r>
-        <w:rPr>
-          <w:b/>
-          <w:bCs/>
-          <w:sz w:val="36"/>
-          <w:szCs w:val="36"/>
-        </w:rPr>
-        <w:t>)</w:t>
-      </w:r>
-      <w:r>
-        <w:rPr>
-          <w:sz w:val="36"/>
-          <w:szCs w:val="36"/>
-        </w:rPr>
-        <w:t>, just make sure to use</w:t>
-      </w:r>
-      <w:r>
-        <w:rPr>
-          <w:b/>
-          <w:bCs/>
-          <w:sz w:val="36"/>
-          <w:szCs w:val="36"/>
-        </w:rPr>
-        <w:t xml:space="preserve"> </w:t>
-      </w:r>
-      <w:proofErr w:type="spellStart"/>
-      <w:r>
-        <w:rPr>
-          <w:b/>
-          <w:bCs/>
-          <w:sz w:val="36"/>
-          <w:szCs w:val="36"/>
-        </w:rPr>
-        <w:t>StatefulWidget</w:t>
-      </w:r>
-      <w:proofErr w:type="spellEnd"/>
-      <w:r>
-        <w:rPr>
-          <w:sz w:val="36"/>
-          <w:szCs w:val="36"/>
-        </w:rPr>
-        <w:t xml:space="preserve"> to initialize in</w:t>
-      </w:r>
-      <w:r>
-        <w:rPr>
-          <w:b/>
-          <w:bCs/>
-          <w:sz w:val="36"/>
-          <w:szCs w:val="36"/>
-        </w:rPr>
-        <w:t xml:space="preserve"> </w:t>
-      </w:r>
-      <w:proofErr w:type="spellStart"/>
-      <w:r>
-        <w:rPr>
-          <w:b/>
-          <w:bCs/>
-          <w:sz w:val="36"/>
-          <w:szCs w:val="36"/>
-        </w:rPr>
-        <w:t>ValueNotifier</w:t>
-      </w:r>
-      <w:proofErr w:type="spellEnd"/>
-      <w:r>
-        <w:rPr>
-          <w:sz w:val="36"/>
-          <w:szCs w:val="36"/>
-        </w:rPr>
-        <w:t xml:space="preserve"> in</w:t>
-      </w:r>
-      <w:r>
-        <w:rPr>
-          <w:b/>
-          <w:bCs/>
-          <w:sz w:val="36"/>
-          <w:szCs w:val="36"/>
-        </w:rPr>
-        <w:t xml:space="preserve"> </w:t>
-      </w:r>
-      <w:proofErr w:type="spellStart"/>
-      <w:r>
-        <w:rPr>
-          <w:b/>
-          <w:bCs/>
-          <w:sz w:val="36"/>
-          <w:szCs w:val="36"/>
-        </w:rPr>
-        <w:t>initState</w:t>
-      </w:r>
-      <w:proofErr w:type="spellEnd"/>
-      <w:r>
-        <w:rPr>
-          <w:b/>
-          <w:bCs/>
-          <w:sz w:val="36"/>
-          <w:szCs w:val="36"/>
-        </w:rPr>
-        <w:t xml:space="preserve"> </w:t>
-      </w:r>
-      <w:r>
-        <w:rPr>
-          <w:sz w:val="36"/>
-          <w:szCs w:val="36"/>
-        </w:rPr>
-        <w:t>and dispose it</w:t>
-      </w:r>
-    </w:p>
-    <w:p>
-      <w:pPr>
-        <w:jc w:val="both"/>
-        <w:rPr>
-          <w:sz w:val="36"/>
-          <w:szCs w:val="36"/>
-        </w:rPr>
-      </w:pPr>
-    </w:p>
-    <w:p>
-      <w:pPr>
-        <w:jc w:val="both"/>
-        <w:rPr>
-          <w:b/>
-          <w:bCs/>
-          <w:sz w:val="36"/>
-          <w:szCs w:val="36"/>
-        </w:rPr>
-      </w:pPr>
-      <w:r>
-        <w:rPr>
-          <w:b/>
-          <w:bCs/>
-          <w:sz w:val="36"/>
-          <w:szCs w:val="36"/>
-        </w:rPr>
         <w:t xml:space="preserve">Platform Specific Asset Building (In </w:t>
       </w:r>
       <w:proofErr w:type="spellStart"/>
@@ -15387,7 +11978,6 @@
           <w:sz w:val="36"/>
           <w:szCs w:val="36"/>
         </w:rPr>
-        <w:lastRenderedPageBreak/>
         <w:t xml:space="preserve">Efficient state management – prefer </w:t>
       </w:r>
       <w:proofErr w:type="spellStart"/>
@@ -15700,6 +12290,7 @@
           <w:sz w:val="36"/>
           <w:szCs w:val="36"/>
         </w:rPr>
+        <w:lastRenderedPageBreak/>
         <w:t xml:space="preserve">Optimize animations – use </w:t>
       </w:r>
       <w:proofErr w:type="spellStart"/>
@@ -15899,7 +12490,6 @@
           <w:sz w:val="36"/>
           <w:szCs w:val="36"/>
         </w:rPr>
-        <w:lastRenderedPageBreak/>
         <w:t xml:space="preserve">Minimize repaints with </w:t>
       </w:r>
       <w:proofErr w:type="spellStart"/>
@@ -16133,6 +12723,7 @@
           <w:sz w:val="36"/>
           <w:szCs w:val="36"/>
         </w:rPr>
+        <w:lastRenderedPageBreak/>
         <w:t>Fluttercomponentlibrary.com</w:t>
       </w:r>
     </w:p>
@@ -16260,7 +12851,6 @@
           <w:sz w:val="36"/>
           <w:szCs w:val="36"/>
         </w:rPr>
-        <w:lastRenderedPageBreak/>
         <w:t># Go to this website it gives us different architecture (folder structure) templates like:</w:t>
       </w:r>
     </w:p>
@@ -16630,6 +13220,7 @@
           <w:sz w:val="36"/>
           <w:szCs w:val="36"/>
         </w:rPr>
+        <w:lastRenderedPageBreak/>
         <w:t xml:space="preserve">Localization setup using </w:t>
       </w:r>
       <w:proofErr w:type="spellStart"/>

</xml_diff>